<commit_message>
docs: refine commercial pricing and onboarding plan
</commit_message>
<xml_diff>
--- a/docs/Plan_Comercial_Nexo_Klar_2026_2027.docx
+++ b/docs/Plan_Comercial_Nexo_Klar_2026_2027.docx
@@ -123,6 +123,9 @@
       </w:pPr>
     </w:p>
     <w:p>
+      <w:pPr>
+        <w:jc w:val="center"/>
+      </w:pPr>
       <w:r>
         <w:drawing>
           <wp:inline xmlns:a="http://schemas.openxmlformats.org/drawingml/2006/main" xmlns:pic="http://schemas.openxmlformats.org/drawingml/2006/picture">
@@ -3309,7 +3312,7 @@
           <w:color w:val="141A20"/>
           <w:sz w:val="48"/>
         </w:rPr>
-        <w:t>6. Oferta SaaS recomendada</w:t>
+        <w:t>6. Referencia de mercado y criterio de precio</w:t>
       </w:r>
     </w:p>
     <w:p>
@@ -3322,7 +3325,20 @@
           <w:color w:val="5D6B7A"/>
           <w:sz w:val="22"/>
         </w:rPr>
-        <w:t>Tres planes simples y servicios adicionales</w:t>
+        <w:t>Precio transparente, valor protegido y negociación simple</w:t>
+      </w:r>
+    </w:p>
+    <w:p>
+      <w:pPr>
+        <w:spacing w:after="120" w:line="276" w:lineRule="auto"/>
+      </w:pPr>
+      <w:r>
+        <w:rPr>
+          <w:rFonts w:ascii="Arial" w:hAnsi="Arial"/>
+          <w:color w:val="141A20"/>
+          <w:sz w:val="20"/>
+        </w:rPr>
+        <w:t>En Chile, gran parte de las plataformas de acreditación y gestión de contratistas cotiza según alcance, personas, sedes, documentos e implementación. En field service internacional se observa una combinación de suscripción por usuario, niveles funcionales, complementos y acompañamiento pagado. Nexo Klar debe ocupar esa lógica: una tarifa base clara, crecimiento por uso y servicios de implementación visibles.</w:t>
       </w:r>
     </w:p>
     <w:tbl>
@@ -3333,10 +3349,560 @@
         <w:tblLook w:firstColumn="1" w:firstRow="1" w:lastColumn="0" w:lastRow="0" w:noHBand="0" w:noVBand="1" w:val="04A0"/>
       </w:tblPr>
       <w:tblGrid>
-        <w:gridCol w:w="1800"/>
-        <w:gridCol w:w="4392"/>
-        <w:gridCol w:w="2376"/>
+        <w:gridCol w:w="2088"/>
+        <w:gridCol w:w="3816"/>
+        <w:gridCol w:w="4608"/>
+      </w:tblGrid>
+      <w:tr>
+        <w:tc>
+          <w:tcPr>
+            <w:tcW w:type="dxa" w:w="3389"/>
+            <w:shd w:fill="1A1A5E"/>
+            <w:tcBorders>
+              <w:top w:val="single" w:sz="8" w:color="1A1A5E"/>
+              <w:left w:val="single" w:sz="8" w:color="1A1A5E"/>
+              <w:bottom w:val="single" w:sz="8" w:color="1A1A5E"/>
+              <w:right w:val="single" w:sz="8" w:color="1A1A5E"/>
+            </w:tcBorders>
+            <w:vAlign w:val="center"/>
+          </w:tcPr>
+          <w:p>
+            <w:pPr>
+              <w:spacing w:after="60" w:before="60"/>
+            </w:pPr>
+            <w:r/>
+            <w:r>
+              <w:rPr>
+                <w:rFonts w:ascii="Arial" w:hAnsi="Arial"/>
+                <w:b/>
+                <w:color w:val="FFFFFF"/>
+                <w:sz w:val="17"/>
+              </w:rPr>
+              <w:t>Referencia pública</w:t>
+            </w:r>
+          </w:p>
+        </w:tc>
+        <w:tc>
+          <w:tcPr>
+            <w:tcW w:type="dxa" w:w="3389"/>
+            <w:shd w:fill="1A1A5E"/>
+            <w:tcBorders>
+              <w:top w:val="single" w:sz="8" w:color="1A1A5E"/>
+              <w:left w:val="single" w:sz="8" w:color="1A1A5E"/>
+              <w:bottom w:val="single" w:sz="8" w:color="1A1A5E"/>
+              <w:right w:val="single" w:sz="8" w:color="1A1A5E"/>
+            </w:tcBorders>
+            <w:vAlign w:val="center"/>
+          </w:tcPr>
+          <w:p>
+            <w:pPr>
+              <w:spacing w:after="60" w:before="60"/>
+            </w:pPr>
+            <w:r/>
+            <w:r>
+              <w:rPr>
+                <w:rFonts w:ascii="Arial" w:hAnsi="Arial"/>
+                <w:b/>
+                <w:color w:val="FFFFFF"/>
+                <w:sz w:val="17"/>
+              </w:rPr>
+              <w:t>Modelo comercial observado</w:t>
+            </w:r>
+          </w:p>
+        </w:tc>
+        <w:tc>
+          <w:tcPr>
+            <w:tcW w:type="dxa" w:w="3389"/>
+            <w:shd w:fill="1A1A5E"/>
+            <w:tcBorders>
+              <w:top w:val="single" w:sz="8" w:color="1A1A5E"/>
+              <w:left w:val="single" w:sz="8" w:color="1A1A5E"/>
+              <w:bottom w:val="single" w:sz="8" w:color="1A1A5E"/>
+              <w:right w:val="single" w:sz="8" w:color="1A1A5E"/>
+            </w:tcBorders>
+            <w:vAlign w:val="center"/>
+          </w:tcPr>
+          <w:p>
+            <w:pPr>
+              <w:spacing w:after="60" w:before="60"/>
+            </w:pPr>
+            <w:r/>
+            <w:r>
+              <w:rPr>
+                <w:rFonts w:ascii="Arial" w:hAnsi="Arial"/>
+                <w:b/>
+                <w:color w:val="FFFFFF"/>
+                <w:sz w:val="17"/>
+              </w:rPr>
+              <w:t>Implicancia para Nexo Klar</w:t>
+            </w:r>
+          </w:p>
+        </w:tc>
+      </w:tr>
+      <w:tr>
+        <w:tc>
+          <w:tcPr>
+            <w:tcW w:type="dxa" w:w="2088"/>
+            <w:shd w:fill="FBF9F5"/>
+            <w:tcBorders>
+              <w:top w:val="single" w:sz="8" w:color="E3DED2"/>
+              <w:left w:val="single" w:sz="8" w:color="E3DED2"/>
+              <w:bottom w:val="single" w:sz="8" w:color="E3DED2"/>
+              <w:right w:val="single" w:sz="8" w:color="E3DED2"/>
+            </w:tcBorders>
+            <w:vAlign w:val="center"/>
+          </w:tcPr>
+          <w:p>
+            <w:pPr>
+              <w:spacing w:after="60" w:before="60"/>
+            </w:pPr>
+            <w:r/>
+            <w:r>
+              <w:rPr>
+                <w:rFonts w:ascii="Arial" w:hAnsi="Arial"/>
+                <w:b w:val="0"/>
+                <w:color w:val="141A20"/>
+                <w:sz w:val="17"/>
+              </w:rPr>
+              <w:t>FieldPulse</w:t>
+            </w:r>
+          </w:p>
+        </w:tc>
+        <w:tc>
+          <w:tcPr>
+            <w:tcW w:type="dxa" w:w="3816"/>
+            <w:shd w:fill="FBF9F5"/>
+            <w:tcBorders>
+              <w:top w:val="single" w:sz="8" w:color="E3DED2"/>
+              <w:left w:val="single" w:sz="8" w:color="E3DED2"/>
+              <w:bottom w:val="single" w:sz="8" w:color="E3DED2"/>
+              <w:right w:val="single" w:sz="8" w:color="E3DED2"/>
+            </w:tcBorders>
+            <w:vAlign w:val="center"/>
+          </w:tcPr>
+          <w:p>
+            <w:pPr>
+              <w:spacing w:after="60" w:before="60"/>
+            </w:pPr>
+            <w:r/>
+            <w:r>
+              <w:rPr>
+                <w:rFonts w:ascii="Arial" w:hAnsi="Arial"/>
+                <w:b w:val="0"/>
+                <w:color w:val="141A20"/>
+                <w:sz w:val="17"/>
+              </w:rPr>
+              <w:t>Precio por usuario y cotización personalizada por paquete; complementos de IA, flota, formularios y soporte.</w:t>
+            </w:r>
+          </w:p>
+        </w:tc>
+        <w:tc>
+          <w:tcPr>
+            <w:tcW w:type="dxa" w:w="4608"/>
+            <w:shd w:fill="FBF9F5"/>
+            <w:tcBorders>
+              <w:top w:val="single" w:sz="8" w:color="E3DED2"/>
+              <w:left w:val="single" w:sz="8" w:color="E3DED2"/>
+              <w:bottom w:val="single" w:sz="8" w:color="E3DED2"/>
+              <w:right w:val="single" w:sz="8" w:color="E3DED2"/>
+            </w:tcBorders>
+            <w:vAlign w:val="center"/>
+          </w:tcPr>
+          <w:p>
+            <w:pPr>
+              <w:spacing w:after="60" w:before="60"/>
+            </w:pPr>
+            <w:r/>
+            <w:r>
+              <w:rPr>
+                <w:rFonts w:ascii="Arial" w:hAnsi="Arial"/>
+                <w:b w:val="0"/>
+                <w:color w:val="141A20"/>
+                <w:sz w:val="17"/>
+              </w:rPr>
+              <w:t>Cobrar por escala y no esconder el valor de módulos o soporte especializado.</w:t>
+            </w:r>
+          </w:p>
+        </w:tc>
+      </w:tr>
+      <w:tr>
+        <w:tc>
+          <w:tcPr>
+            <w:tcW w:type="dxa" w:w="2088"/>
+            <w:shd w:fill="FFFFFF"/>
+            <w:tcBorders>
+              <w:top w:val="single" w:sz="8" w:color="E3DED2"/>
+              <w:left w:val="single" w:sz="8" w:color="E3DED2"/>
+              <w:bottom w:val="single" w:sz="8" w:color="E3DED2"/>
+              <w:right w:val="single" w:sz="8" w:color="E3DED2"/>
+            </w:tcBorders>
+            <w:vAlign w:val="center"/>
+          </w:tcPr>
+          <w:p>
+            <w:pPr>
+              <w:spacing w:after="60" w:before="60"/>
+            </w:pPr>
+            <w:r/>
+            <w:r>
+              <w:rPr>
+                <w:rFonts w:ascii="Arial" w:hAnsi="Arial"/>
+                <w:b w:val="0"/>
+                <w:color w:val="141A20"/>
+                <w:sz w:val="17"/>
+              </w:rPr>
+              <w:t>Housecall Pro</w:t>
+            </w:r>
+          </w:p>
+        </w:tc>
+        <w:tc>
+          <w:tcPr>
+            <w:tcW w:type="dxa" w:w="3816"/>
+            <w:shd w:fill="FFFFFF"/>
+            <w:tcBorders>
+              <w:top w:val="single" w:sz="8" w:color="E3DED2"/>
+              <w:left w:val="single" w:sz="8" w:color="E3DED2"/>
+              <w:bottom w:val="single" w:sz="8" w:color="E3DED2"/>
+              <w:right w:val="single" w:sz="8" w:color="E3DED2"/>
+            </w:tcBorders>
+            <w:vAlign w:val="center"/>
+          </w:tcPr>
+          <w:p>
+            <w:pPr>
+              <w:spacing w:after="60" w:before="60"/>
+            </w:pPr>
+            <w:r/>
+            <w:r>
+              <w:rPr>
+                <w:rFonts w:ascii="Arial" w:hAnsi="Arial"/>
+                <w:b w:val="0"/>
+                <w:color w:val="141A20"/>
+                <w:sz w:val="17"/>
+              </w:rPr>
+              <w:t>Planes públicos desde USD 59/mes y niveles superiores; suma usuarios y onboarding especializado en planes altos.</w:t>
+            </w:r>
+          </w:p>
+        </w:tc>
+        <w:tc>
+          <w:tcPr>
+            <w:tcW w:type="dxa" w:w="4608"/>
+            <w:shd w:fill="FFFFFF"/>
+            <w:tcBorders>
+              <w:top w:val="single" w:sz="8" w:color="E3DED2"/>
+              <w:left w:val="single" w:sz="8" w:color="E3DED2"/>
+              <w:bottom w:val="single" w:sz="8" w:color="E3DED2"/>
+              <w:right w:val="single" w:sz="8" w:color="E3DED2"/>
+            </w:tcBorders>
+            <w:vAlign w:val="center"/>
+          </w:tcPr>
+          <w:p>
+            <w:pPr>
+              <w:spacing w:after="60" w:before="60"/>
+            </w:pPr>
+            <w:r/>
+            <w:r>
+              <w:rPr>
+                <w:rFonts w:ascii="Arial" w:hAnsi="Arial"/>
+                <w:b w:val="0"/>
+                <w:color w:val="141A20"/>
+                <w:sz w:val="17"/>
+              </w:rPr>
+              <w:t>Mantener un plan de entrada simple y usar soporte/acompañamiento como diferenciador de niveles.</w:t>
+            </w:r>
+          </w:p>
+        </w:tc>
+      </w:tr>
+      <w:tr>
+        <w:tc>
+          <w:tcPr>
+            <w:tcW w:type="dxa" w:w="2088"/>
+            <w:shd w:fill="FBF9F5"/>
+            <w:tcBorders>
+              <w:top w:val="single" w:sz="8" w:color="E3DED2"/>
+              <w:left w:val="single" w:sz="8" w:color="E3DED2"/>
+              <w:bottom w:val="single" w:sz="8" w:color="E3DED2"/>
+              <w:right w:val="single" w:sz="8" w:color="E3DED2"/>
+            </w:tcBorders>
+            <w:vAlign w:val="center"/>
+          </w:tcPr>
+          <w:p>
+            <w:pPr>
+              <w:spacing w:after="60" w:before="60"/>
+            </w:pPr>
+            <w:r/>
+            <w:r>
+              <w:rPr>
+                <w:rFonts w:ascii="Arial" w:hAnsi="Arial"/>
+                <w:b w:val="0"/>
+                <w:color w:val="141A20"/>
+                <w:sz w:val="17"/>
+              </w:rPr>
+              <w:t>ServiceM8</w:t>
+            </w:r>
+          </w:p>
+        </w:tc>
+        <w:tc>
+          <w:tcPr>
+            <w:tcW w:type="dxa" w:w="3816"/>
+            <w:shd w:fill="FBF9F5"/>
+            <w:tcBorders>
+              <w:top w:val="single" w:sz="8" w:color="E3DED2"/>
+              <w:left w:val="single" w:sz="8" w:color="E3DED2"/>
+              <w:bottom w:val="single" w:sz="8" w:color="E3DED2"/>
+              <w:right w:val="single" w:sz="8" w:color="E3DED2"/>
+            </w:tcBorders>
+            <w:vAlign w:val="center"/>
+          </w:tcPr>
+          <w:p>
+            <w:pPr>
+              <w:spacing w:after="60" w:before="60"/>
+            </w:pPr>
+            <w:r/>
+            <w:r>
+              <w:rPr>
+                <w:rFonts w:ascii="Arial" w:hAnsi="Arial"/>
+                <w:b w:val="0"/>
+                <w:color w:val="141A20"/>
+                <w:sz w:val="17"/>
+              </w:rPr>
+              <w:t>Inicio autoguiado o implementación y capacitación con socios especializados.</w:t>
+            </w:r>
+          </w:p>
+        </w:tc>
+        <w:tc>
+          <w:tcPr>
+            <w:tcW w:type="dxa" w:w="4608"/>
+            <w:shd w:fill="FBF9F5"/>
+            <w:tcBorders>
+              <w:top w:val="single" w:sz="8" w:color="E3DED2"/>
+              <w:left w:val="single" w:sz="8" w:color="E3DED2"/>
+              <w:bottom w:val="single" w:sz="8" w:color="E3DED2"/>
+              <w:right w:val="single" w:sz="8" w:color="E3DED2"/>
+            </w:tcBorders>
+            <w:vAlign w:val="center"/>
+          </w:tcPr>
+          <w:p>
+            <w:pPr>
+              <w:spacing w:after="60" w:before="60"/>
+            </w:pPr>
+            <w:r/>
+            <w:r>
+              <w:rPr>
+                <w:rFonts w:ascii="Arial" w:hAnsi="Arial"/>
+                <w:b w:val="0"/>
+                <w:color w:val="141A20"/>
+                <w:sz w:val="17"/>
+              </w:rPr>
+              <w:t>Ofrecer carga autoguiada y carga asistida como alternativas, no una sola tarifa rígida.</w:t>
+            </w:r>
+          </w:p>
+        </w:tc>
+      </w:tr>
+      <w:tr>
+        <w:tc>
+          <w:tcPr>
+            <w:tcW w:type="dxa" w:w="2088"/>
+            <w:shd w:fill="FFFFFF"/>
+            <w:tcBorders>
+              <w:top w:val="single" w:sz="8" w:color="E3DED2"/>
+              <w:left w:val="single" w:sz="8" w:color="E3DED2"/>
+              <w:bottom w:val="single" w:sz="8" w:color="E3DED2"/>
+              <w:right w:val="single" w:sz="8" w:color="E3DED2"/>
+            </w:tcBorders>
+            <w:vAlign w:val="center"/>
+          </w:tcPr>
+          <w:p>
+            <w:pPr>
+              <w:spacing w:after="60" w:before="60"/>
+            </w:pPr>
+            <w:r/>
+            <w:r>
+              <w:rPr>
+                <w:rFonts w:ascii="Arial" w:hAnsi="Arial"/>
+                <w:b w:val="0"/>
+                <w:color w:val="141A20"/>
+                <w:sz w:val="17"/>
+              </w:rPr>
+              <w:t>Mercado chileno de contratistas</w:t>
+            </w:r>
+          </w:p>
+        </w:tc>
+        <w:tc>
+          <w:tcPr>
+            <w:tcW w:type="dxa" w:w="3816"/>
+            <w:shd w:fill="FFFFFF"/>
+            <w:tcBorders>
+              <w:top w:val="single" w:sz="8" w:color="E3DED2"/>
+              <w:left w:val="single" w:sz="8" w:color="E3DED2"/>
+              <w:bottom w:val="single" w:sz="8" w:color="E3DED2"/>
+              <w:right w:val="single" w:sz="8" w:color="E3DED2"/>
+            </w:tcBorders>
+            <w:vAlign w:val="center"/>
+          </w:tcPr>
+          <w:p>
+            <w:pPr>
+              <w:spacing w:after="60" w:before="60"/>
+            </w:pPr>
+            <w:r/>
+            <w:r>
+              <w:rPr>
+                <w:rFonts w:ascii="Arial" w:hAnsi="Arial"/>
+                <w:b w:val="0"/>
+                <w:color w:val="141A20"/>
+                <w:sz w:val="17"/>
+              </w:rPr>
+              <w:t>Plataformas de acreditación, cumplimiento y subcontratación normalmente solicitan cotización según empresa y alcance.</w:t>
+            </w:r>
+          </w:p>
+        </w:tc>
+        <w:tc>
+          <w:tcPr>
+            <w:tcW w:type="dxa" w:w="4608"/>
+            <w:shd w:fill="FFFFFF"/>
+            <w:tcBorders>
+              <w:top w:val="single" w:sz="8" w:color="E3DED2"/>
+              <w:left w:val="single" w:sz="8" w:color="E3DED2"/>
+              <w:bottom w:val="single" w:sz="8" w:color="E3DED2"/>
+              <w:right w:val="single" w:sz="8" w:color="E3DED2"/>
+            </w:tcBorders>
+            <w:vAlign w:val="center"/>
+          </w:tcPr>
+          <w:p>
+            <w:pPr>
+              <w:spacing w:after="60" w:before="60"/>
+            </w:pPr>
+            <w:r/>
+            <w:r>
+              <w:rPr>
+                <w:rFonts w:ascii="Arial" w:hAnsi="Arial"/>
+                <w:b w:val="0"/>
+                <w:color w:val="141A20"/>
+                <w:sz w:val="17"/>
+              </w:rPr>
+              <w:t>Posicionar Nexo Klar por valor integrado y cotización empresarial, manteniendo precios referenciales públicos.</w:t>
+            </w:r>
+          </w:p>
+        </w:tc>
+      </w:tr>
+    </w:tbl>
+    <w:p>
+      <w:pPr>
+        <w:spacing w:after="40"/>
+      </w:pPr>
+    </w:p>
+    <w:tbl>
+      <w:tblPr>
+        <w:tblW w:type="auto" w:w="0"/>
+        <w:jc w:val="center"/>
+        <w:tblLayout w:type="fixed"/>
+        <w:tblLook w:firstColumn="1" w:firstRow="1" w:lastColumn="0" w:lastRow="0" w:noHBand="0" w:noVBand="1" w:val="04A0"/>
+      </w:tblPr>
+      <w:tblGrid>
         <w:gridCol w:w="1944"/>
+        <w:gridCol w:w="8280"/>
+      </w:tblGrid>
+      <w:tr>
+        <w:tc>
+          <w:tcPr>
+            <w:tcW w:type="dxa" w:w="5083"/>
+            <w:shd w:fill="EAFBF9"/>
+            <w:tcBorders>
+              <w:top w:val="single" w:sz="8" w:color="BDEDE8"/>
+              <w:left w:val="single" w:sz="8" w:color="BDEDE8"/>
+              <w:bottom w:val="single" w:sz="8" w:color="BDEDE8"/>
+              <w:right w:val="single" w:sz="8" w:color="BDEDE8"/>
+            </w:tcBorders>
+            <w:vAlign w:val="center"/>
+          </w:tcPr>
+          <w:p>
+            <w:pPr>
+              <w:spacing w:after="60" w:before="60"/>
+            </w:pPr>
+            <w:r/>
+            <w:r>
+              <w:rPr>
+                <w:rFonts w:ascii="Arial" w:hAnsi="Arial"/>
+                <w:b/>
+                <w:color w:val="2A2A8C"/>
+                <w:sz w:val="18"/>
+              </w:rPr>
+              <w:t>Criterio comercial</w:t>
+            </w:r>
+          </w:p>
+        </w:tc>
+        <w:tc>
+          <w:tcPr>
+            <w:tcW w:type="dxa" w:w="5083"/>
+            <w:shd w:fill="EAFBF9"/>
+            <w:tcBorders>
+              <w:top w:val="single" w:sz="8" w:color="BDEDE8"/>
+              <w:left w:val="single" w:sz="8" w:color="BDEDE8"/>
+              <w:bottom w:val="single" w:sz="8" w:color="BDEDE8"/>
+              <w:right w:val="single" w:sz="8" w:color="BDEDE8"/>
+            </w:tcBorders>
+            <w:vAlign w:val="center"/>
+          </w:tcPr>
+          <w:p>
+            <w:pPr>
+              <w:spacing w:after="60" w:before="60"/>
+            </w:pPr>
+            <w:r/>
+            <w:r>
+              <w:rPr>
+                <w:rFonts w:ascii="Arial" w:hAnsi="Arial"/>
+                <w:b w:val="0"/>
+                <w:color w:val="141A20"/>
+                <w:sz w:val="18"/>
+              </w:rPr>
+              <w:t>No competir solo por precio. El precio base debe abrir la conversación; la implementación, los activos adicionales, las integraciones y el soporte reflejan el esfuerzo real y se cotizan por alcance.</w:t>
+            </w:r>
+          </w:p>
+        </w:tc>
+      </w:tr>
+    </w:tbl>
+    <w:p>
+      <w:pPr>
+        <w:spacing w:after="20"/>
+      </w:pPr>
+    </w:p>
+    <w:p>
+      <w:pPr>
+        <w:spacing w:after="120"/>
+      </w:pPr>
+      <w:r>
+        <w:rPr>
+          <w:rFonts w:ascii="Arial" w:hAnsi="Arial"/>
+          <w:b/>
+          <w:color w:val="141A20"/>
+          <w:sz w:val="48"/>
+        </w:rPr>
+        <w:t>7. Oferta SaaS recomendada</w:t>
+      </w:r>
+    </w:p>
+    <w:p>
+      <w:pPr>
+        <w:spacing w:after="240"/>
+      </w:pPr>
+      <w:r>
+        <w:rPr>
+          <w:rFonts w:ascii="Arial" w:hAnsi="Arial"/>
+          <w:color w:val="5D6B7A"/>
+          <w:sz w:val="22"/>
+        </w:rPr>
+        <w:t>Tres planes claros, escalables y negociables</w:t>
+      </w:r>
+    </w:p>
+    <w:tbl>
+      <w:tblPr>
+        <w:tblW w:type="auto" w:w="0"/>
+        <w:jc w:val="center"/>
+        <w:tblLayout w:type="fixed"/>
+        <w:tblLook w:firstColumn="1" w:firstRow="1" w:lastColumn="0" w:lastRow="0" w:noHBand="0" w:noVBand="1" w:val="04A0"/>
+      </w:tblPr>
+      <w:tblGrid>
+        <w:gridCol w:w="1944"/>
+        <w:gridCol w:w="4968"/>
+        <w:gridCol w:w="1728"/>
+        <w:gridCol w:w="1872"/>
       </w:tblGrid>
       <w:tr>
         <w:tc>
@@ -3391,7 +3957,7 @@
                 <w:color w:val="FFFFFF"/>
                 <w:sz w:val="17"/>
               </w:rPr>
-              <w:t>Enfoque y módulos</w:t>
+              <w:t>Incluye</w:t>
             </w:r>
           </w:p>
         </w:tc>
@@ -3419,7 +3985,7 @@
                 <w:color w:val="FFFFFF"/>
                 <w:sz w:val="17"/>
               </w:rPr>
-              <w:t>Cliente objetivo</w:t>
+              <w:t>Escala incluida</w:t>
             </w:r>
           </w:p>
         </w:tc>
@@ -3447,96 +4013,12 @@
                 <w:color w:val="FFFFFF"/>
                 <w:sz w:val="17"/>
               </w:rPr>
-              <w:t>Precio referencial neto CLP</w:t>
+              <w:t>Precio lista neto CLP</w:t>
             </w:r>
           </w:p>
         </w:tc>
       </w:tr>
       <w:tr>
-        <w:tc>
-          <w:tcPr>
-            <w:tcW w:type="dxa" w:w="1800"/>
-            <w:shd w:fill="FBF9F5"/>
-            <w:tcBorders>
-              <w:top w:val="single" w:sz="8" w:color="E3DED2"/>
-              <w:left w:val="single" w:sz="8" w:color="E3DED2"/>
-              <w:bottom w:val="single" w:sz="8" w:color="E3DED2"/>
-              <w:right w:val="single" w:sz="8" w:color="E3DED2"/>
-            </w:tcBorders>
-            <w:vAlign w:val="center"/>
-          </w:tcPr>
-          <w:p>
-            <w:pPr>
-              <w:spacing w:after="60" w:before="60"/>
-            </w:pPr>
-            <w:r/>
-            <w:r>
-              <w:rPr>
-                <w:rFonts w:ascii="Arial" w:hAnsi="Arial"/>
-                <w:b w:val="0"/>
-                <w:color w:val="141A20"/>
-                <w:sz w:val="17"/>
-              </w:rPr>
-              <w:t>Nexo Klar Esencial</w:t>
-            </w:r>
-          </w:p>
-        </w:tc>
-        <w:tc>
-          <w:tcPr>
-            <w:tcW w:type="dxa" w:w="4392"/>
-            <w:shd w:fill="FBF9F5"/>
-            <w:tcBorders>
-              <w:top w:val="single" w:sz="8" w:color="E3DED2"/>
-              <w:left w:val="single" w:sz="8" w:color="E3DED2"/>
-              <w:bottom w:val="single" w:sz="8" w:color="E3DED2"/>
-              <w:right w:val="single" w:sz="8" w:color="E3DED2"/>
-            </w:tcBorders>
-            <w:vAlign w:val="center"/>
-          </w:tcPr>
-          <w:p>
-            <w:pPr>
-              <w:spacing w:after="60" w:before="60"/>
-            </w:pPr>
-            <w:r/>
-            <w:r>
-              <w:rPr>
-                <w:rFonts w:ascii="Arial" w:hAnsi="Arial"/>
-                <w:b w:val="0"/>
-                <w:color w:val="141A20"/>
-                <w:sz w:val="17"/>
-              </w:rPr>
-              <w:t>Clientes, contratos, órdenes de servicio, personas, alertas básicas, documentos, reportes, usuarios, configuración e importación/exportación.</w:t>
-            </w:r>
-          </w:p>
-        </w:tc>
-        <w:tc>
-          <w:tcPr>
-            <w:tcW w:type="dxa" w:w="2376"/>
-            <w:shd w:fill="FBF9F5"/>
-            <w:tcBorders>
-              <w:top w:val="single" w:sz="8" w:color="E3DED2"/>
-              <w:left w:val="single" w:sz="8" w:color="E3DED2"/>
-              <w:bottom w:val="single" w:sz="8" w:color="E3DED2"/>
-              <w:right w:val="single" w:sz="8" w:color="E3DED2"/>
-            </w:tcBorders>
-            <w:vAlign w:val="center"/>
-          </w:tcPr>
-          <w:p>
-            <w:pPr>
-              <w:spacing w:after="60" w:before="60"/>
-            </w:pPr>
-            <w:r/>
-            <w:r>
-              <w:rPr>
-                <w:rFonts w:ascii="Arial" w:hAnsi="Arial"/>
-                <w:b w:val="0"/>
-                <w:color w:val="141A20"/>
-                <w:sz w:val="17"/>
-              </w:rPr>
-              <w:t>Empresa que quiere dejar planillas y ordenar el control inicial.</w:t>
-            </w:r>
-          </w:p>
-        </w:tc>
         <w:tc>
           <w:tcPr>
             <w:tcW w:type="dxa" w:w="1944"/>
@@ -3561,7 +4043,91 @@
                 <w:color w:val="141A20"/>
                 <w:sz w:val="17"/>
               </w:rPr>
-              <w:t>$180.000/mes + setup $250.000</w:t>
+              <w:t>Nexo Klar Base</w:t>
+            </w:r>
+          </w:p>
+        </w:tc>
+        <w:tc>
+          <w:tcPr>
+            <w:tcW w:type="dxa" w:w="4968"/>
+            <w:shd w:fill="FBF9F5"/>
+            <w:tcBorders>
+              <w:top w:val="single" w:sz="8" w:color="E3DED2"/>
+              <w:left w:val="single" w:sz="8" w:color="E3DED2"/>
+              <w:bottom w:val="single" w:sz="8" w:color="E3DED2"/>
+              <w:right w:val="single" w:sz="8" w:color="E3DED2"/>
+            </w:tcBorders>
+            <w:vAlign w:val="center"/>
+          </w:tcPr>
+          <w:p>
+            <w:pPr>
+              <w:spacing w:after="60" w:before="60"/>
+            </w:pPr>
+            <w:r/>
+            <w:r>
+              <w:rPr>
+                <w:rFonts w:ascii="Arial" w:hAnsi="Arial"/>
+                <w:b w:val="0"/>
+                <w:color w:val="141A20"/>
+                <w:sz w:val="17"/>
+              </w:rPr>
+              <w:t>Panel, clientes, contratos, órdenes de servicio, personas, alertas, documentos, reportes base, usuarios, configuración e importación/exportación.</w:t>
+            </w:r>
+          </w:p>
+        </w:tc>
+        <w:tc>
+          <w:tcPr>
+            <w:tcW w:type="dxa" w:w="1728"/>
+            <w:shd w:fill="FBF9F5"/>
+            <w:tcBorders>
+              <w:top w:val="single" w:sz="8" w:color="E3DED2"/>
+              <w:left w:val="single" w:sz="8" w:color="E3DED2"/>
+              <w:bottom w:val="single" w:sz="8" w:color="E3DED2"/>
+              <w:right w:val="single" w:sz="8" w:color="E3DED2"/>
+            </w:tcBorders>
+            <w:vAlign w:val="center"/>
+          </w:tcPr>
+          <w:p>
+            <w:pPr>
+              <w:spacing w:after="60" w:before="60"/>
+            </w:pPr>
+            <w:r/>
+            <w:r>
+              <w:rPr>
+                <w:rFonts w:ascii="Arial" w:hAnsi="Arial"/>
+                <w:b w:val="0"/>
+                <w:color w:val="141A20"/>
+                <w:sz w:val="17"/>
+              </w:rPr>
+              <w:t>Hasta 30 personas activas y 5 usuarios nominados.</w:t>
+            </w:r>
+          </w:p>
+        </w:tc>
+        <w:tc>
+          <w:tcPr>
+            <w:tcW w:type="dxa" w:w="1872"/>
+            <w:shd w:fill="FBF9F5"/>
+            <w:tcBorders>
+              <w:top w:val="single" w:sz="8" w:color="E3DED2"/>
+              <w:left w:val="single" w:sz="8" w:color="E3DED2"/>
+              <w:bottom w:val="single" w:sz="8" w:color="E3DED2"/>
+              <w:right w:val="single" w:sz="8" w:color="E3DED2"/>
+            </w:tcBorders>
+            <w:vAlign w:val="center"/>
+          </w:tcPr>
+          <w:p>
+            <w:pPr>
+              <w:spacing w:after="60" w:before="60"/>
+            </w:pPr>
+            <w:r/>
+            <w:r>
+              <w:rPr>
+                <w:rFonts w:ascii="Arial" w:hAnsi="Arial"/>
+                <w:b w:val="0"/>
+                <w:color w:val="141A20"/>
+                <w:sz w:val="17"/>
+              </w:rPr>
+              <w:t>$220.000 / mes</w:t>
             </w:r>
           </w:p>
         </w:tc>
@@ -3569,7 +4135,7 @@
       <w:tr>
         <w:tc>
           <w:tcPr>
-            <w:tcW w:type="dxa" w:w="1800"/>
+            <w:tcW w:type="dxa" w:w="1944"/>
             <w:shd w:fill="FFFFFF"/>
             <w:tcBorders>
               <w:top w:val="single" w:sz="8" w:color="E3DED2"/>
@@ -3597,7 +4163,7 @@
         </w:tc>
         <w:tc>
           <w:tcPr>
-            <w:tcW w:type="dxa" w:w="4392"/>
+            <w:tcW w:type="dxa" w:w="4968"/>
             <w:shd w:fill="FFFFFF"/>
             <w:tcBorders>
               <w:top w:val="single" w:sz="8" w:color="E3DED2"/>
@@ -3619,13 +4185,13 @@
                 <w:color w:val="141A20"/>
                 <w:sz w:val="17"/>
               </w:rPr>
-              <w:t>Todo Esencial + personal por proyecto, turnos, EPP, formación, exámenes, comunicaciones, vehículos, alojamiento, terceros, incidentes y centro operativo.</w:t>
+              <w:t>Todo Base + gestión de personal por proyecto, turnos, EPP, formación, exámenes, comunicaciones, vehículos, estadías, terceros, incidentes y Centro Operativo.</w:t>
             </w:r>
           </w:p>
         </w:tc>
         <w:tc>
           <w:tcPr>
-            <w:tcW w:type="dxa" w:w="2376"/>
+            <w:tcW w:type="dxa" w:w="1728"/>
             <w:shd w:fill="FFFFFF"/>
             <w:tcBorders>
               <w:top w:val="single" w:sz="8" w:color="E3DED2"/>
@@ -3647,13 +4213,13 @@
                 <w:color w:val="141A20"/>
                 <w:sz w:val="17"/>
               </w:rPr>
-              <w:t>Empresa con servicios recurrentes y operación en terreno.</w:t>
+              <w:t>Hasta 75 personas activas y 10 usuarios nominados.</w:t>
             </w:r>
           </w:p>
         </w:tc>
         <w:tc>
           <w:tcPr>
-            <w:tcW w:type="dxa" w:w="1944"/>
+            <w:tcW w:type="dxa" w:w="1872"/>
             <w:shd w:fill="FFFFFF"/>
             <w:tcBorders>
               <w:top w:val="single" w:sz="8" w:color="E3DED2"/>
@@ -3675,7 +4241,7 @@
                 <w:color w:val="141A20"/>
                 <w:sz w:val="17"/>
               </w:rPr>
-              <w:t>$320.000/mes + setup $350.000</w:t>
+              <w:t>$390.000 / mes</w:t>
             </w:r>
           </w:p>
         </w:tc>
@@ -3683,7 +4249,7 @@
       <w:tr>
         <w:tc>
           <w:tcPr>
-            <w:tcW w:type="dxa" w:w="1800"/>
+            <w:tcW w:type="dxa" w:w="1944"/>
             <w:shd w:fill="FBF9F5"/>
             <w:tcBorders>
               <w:top w:val="single" w:sz="8" w:color="E3DED2"/>
@@ -3711,7 +4277,7 @@
         </w:tc>
         <w:tc>
           <w:tcPr>
-            <w:tcW w:type="dxa" w:w="4392"/>
+            <w:tcW w:type="dxa" w:w="4968"/>
             <w:shd w:fill="FBF9F5"/>
             <w:tcBorders>
               <w:top w:val="single" w:sz="8" w:color="E3DED2"/>
@@ -3733,13 +4299,13 @@
                 <w:color w:val="141A20"/>
                 <w:sz w:val="17"/>
               </w:rPr>
-              <w:t>Todo Operación + auditoría avanzada, habilitación, inventario, costos, rentabilidad, automatizaciones, portal, API, identidad visual y analítica ejecutiva.</w:t>
+              <w:t>Todo Operación + auditoría avanzada, habilitación del cliente, activos e inventario, costos, rentabilidad, automatizaciones, portal, API e identidad visual por empresa.</w:t>
             </w:r>
           </w:p>
         </w:tc>
         <w:tc>
           <w:tcPr>
-            <w:tcW w:type="dxa" w:w="2376"/>
+            <w:tcW w:type="dxa" w:w="1728"/>
             <w:shd w:fill="FBF9F5"/>
             <w:tcBorders>
               <w:top w:val="single" w:sz="8" w:color="E3DED2"/>
@@ -3761,13 +4327,13 @@
                 <w:color w:val="141A20"/>
                 <w:sz w:val="17"/>
               </w:rPr>
-              <w:t>Empresa multioperación o con alta exigencia de control y reportabilidad.</w:t>
+              <w:t>Hasta 200 personas activas y 20 usuarios nominados.</w:t>
             </w:r>
           </w:p>
         </w:tc>
         <w:tc>
           <w:tcPr>
-            <w:tcW w:type="dxa" w:w="1944"/>
+            <w:tcW w:type="dxa" w:w="1872"/>
             <w:shd w:fill="FBF9F5"/>
             <w:tcBorders>
               <w:top w:val="single" w:sz="8" w:color="E3DED2"/>
@@ -3789,7 +4355,111 @@
                 <w:color w:val="141A20"/>
                 <w:sz w:val="17"/>
               </w:rPr>
-              <w:t>$520.000/mes + setup $500.000</w:t>
+              <w:t>$690.000 / mes</w:t>
+            </w:r>
+          </w:p>
+        </w:tc>
+      </w:tr>
+    </w:tbl>
+    <w:p>
+      <w:pPr>
+        <w:spacing w:after="40"/>
+      </w:pPr>
+    </w:p>
+    <w:tbl>
+      <w:tblPr>
+        <w:tblW w:type="auto" w:w="0"/>
+        <w:jc w:val="center"/>
+        <w:tblLayout w:type="fixed"/>
+        <w:tblLook w:firstColumn="1" w:firstRow="1" w:lastColumn="0" w:lastRow="0" w:noHBand="0" w:noVBand="1" w:val="04A0"/>
+      </w:tblPr>
+      <w:tblGrid>
+        <w:gridCol w:w="3096"/>
+        <w:gridCol w:w="2232"/>
+        <w:gridCol w:w="5184"/>
+      </w:tblGrid>
+      <w:tr>
+        <w:tc>
+          <w:tcPr>
+            <w:tcW w:type="dxa" w:w="3389"/>
+            <w:shd w:fill="1A1A5E"/>
+            <w:tcBorders>
+              <w:top w:val="single" w:sz="8" w:color="1A1A5E"/>
+              <w:left w:val="single" w:sz="8" w:color="1A1A5E"/>
+              <w:bottom w:val="single" w:sz="8" w:color="1A1A5E"/>
+              <w:right w:val="single" w:sz="8" w:color="1A1A5E"/>
+            </w:tcBorders>
+            <w:vAlign w:val="center"/>
+          </w:tcPr>
+          <w:p>
+            <w:pPr>
+              <w:spacing w:after="60" w:before="60"/>
+            </w:pPr>
+            <w:r/>
+            <w:r>
+              <w:rPr>
+                <w:rFonts w:ascii="Arial" w:hAnsi="Arial"/>
+                <w:b/>
+                <w:color w:val="FFFFFF"/>
+                <w:sz w:val="17"/>
+              </w:rPr>
+              <w:t>Crecimiento y adicionales</w:t>
+            </w:r>
+          </w:p>
+        </w:tc>
+        <w:tc>
+          <w:tcPr>
+            <w:tcW w:type="dxa" w:w="3389"/>
+            <w:shd w:fill="1A1A5E"/>
+            <w:tcBorders>
+              <w:top w:val="single" w:sz="8" w:color="1A1A5E"/>
+              <w:left w:val="single" w:sz="8" w:color="1A1A5E"/>
+              <w:bottom w:val="single" w:sz="8" w:color="1A1A5E"/>
+              <w:right w:val="single" w:sz="8" w:color="1A1A5E"/>
+            </w:tcBorders>
+            <w:vAlign w:val="center"/>
+          </w:tcPr>
+          <w:p>
+            <w:pPr>
+              <w:spacing w:after="60" w:before="60"/>
+            </w:pPr>
+            <w:r/>
+            <w:r>
+              <w:rPr>
+                <w:rFonts w:ascii="Arial" w:hAnsi="Arial"/>
+                <w:b/>
+                <w:color w:val="FFFFFF"/>
+                <w:sz w:val="17"/>
+              </w:rPr>
+              <w:t>Precio lista neto CLP</w:t>
+            </w:r>
+          </w:p>
+        </w:tc>
+        <w:tc>
+          <w:tcPr>
+            <w:tcW w:type="dxa" w:w="3389"/>
+            <w:shd w:fill="1A1A5E"/>
+            <w:tcBorders>
+              <w:top w:val="single" w:sz="8" w:color="1A1A5E"/>
+              <w:left w:val="single" w:sz="8" w:color="1A1A5E"/>
+              <w:bottom w:val="single" w:sz="8" w:color="1A1A5E"/>
+              <w:right w:val="single" w:sz="8" w:color="1A1A5E"/>
+            </w:tcBorders>
+            <w:vAlign w:val="center"/>
+          </w:tcPr>
+          <w:p>
+            <w:pPr>
+              <w:spacing w:after="60" w:before="60"/>
+            </w:pPr>
+            <w:r/>
+            <w:r>
+              <w:rPr>
+                <w:rFonts w:ascii="Arial" w:hAnsi="Arial"/>
+                <w:b/>
+                <w:color w:val="FFFFFF"/>
+                <w:sz w:val="17"/>
+              </w:rPr>
+              <w:t>Regla comercial</w:t>
             </w:r>
           </w:p>
         </w:tc>
@@ -3797,7 +4467,93 @@
       <w:tr>
         <w:tc>
           <w:tcPr>
-            <w:tcW w:type="dxa" w:w="1800"/>
+            <w:tcW w:type="dxa" w:w="3096"/>
+            <w:shd w:fill="FBF9F5"/>
+            <w:tcBorders>
+              <w:top w:val="single" w:sz="8" w:color="E3DED2"/>
+              <w:left w:val="single" w:sz="8" w:color="E3DED2"/>
+              <w:bottom w:val="single" w:sz="8" w:color="E3DED2"/>
+              <w:right w:val="single" w:sz="8" w:color="E3DED2"/>
+            </w:tcBorders>
+            <w:vAlign w:val="center"/>
+          </w:tcPr>
+          <w:p>
+            <w:pPr>
+              <w:spacing w:after="60" w:before="60"/>
+            </w:pPr>
+            <w:r/>
+            <w:r>
+              <w:rPr>
+                <w:rFonts w:ascii="Arial" w:hAnsi="Arial"/>
+                <w:b w:val="0"/>
+                <w:color w:val="141A20"/>
+                <w:sz w:val="17"/>
+              </w:rPr>
+              <w:t>Persona activa adicional</w:t>
+            </w:r>
+          </w:p>
+        </w:tc>
+        <w:tc>
+          <w:tcPr>
+            <w:tcW w:type="dxa" w:w="2232"/>
+            <w:shd w:fill="FBF9F5"/>
+            <w:tcBorders>
+              <w:top w:val="single" w:sz="8" w:color="E3DED2"/>
+              <w:left w:val="single" w:sz="8" w:color="E3DED2"/>
+              <w:bottom w:val="single" w:sz="8" w:color="E3DED2"/>
+              <w:right w:val="single" w:sz="8" w:color="E3DED2"/>
+            </w:tcBorders>
+            <w:vAlign w:val="center"/>
+          </w:tcPr>
+          <w:p>
+            <w:pPr>
+              <w:spacing w:after="60" w:before="60"/>
+            </w:pPr>
+            <w:r/>
+            <w:r>
+              <w:rPr>
+                <w:rFonts w:ascii="Arial" w:hAnsi="Arial"/>
+                <w:b w:val="0"/>
+                <w:color w:val="141A20"/>
+                <w:sz w:val="17"/>
+              </w:rPr>
+              <w:t>Base: $2.500 · Operación: $3.500 · Integral: $5.000 / mes</w:t>
+            </w:r>
+          </w:p>
+        </w:tc>
+        <w:tc>
+          <w:tcPr>
+            <w:tcW w:type="dxa" w:w="5184"/>
+            <w:shd w:fill="FBF9F5"/>
+            <w:tcBorders>
+              <w:top w:val="single" w:sz="8" w:color="E3DED2"/>
+              <w:left w:val="single" w:sz="8" w:color="E3DED2"/>
+              <w:bottom w:val="single" w:sz="8" w:color="E3DED2"/>
+              <w:right w:val="single" w:sz="8" w:color="E3DED2"/>
+            </w:tcBorders>
+            <w:vAlign w:val="center"/>
+          </w:tcPr>
+          <w:p>
+            <w:pPr>
+              <w:spacing w:after="60" w:before="60"/>
+            </w:pPr>
+            <w:r/>
+            <w:r>
+              <w:rPr>
+                <w:rFonts w:ascii="Arial" w:hAnsi="Arial"/>
+                <w:b w:val="0"/>
+                <w:color w:val="141A20"/>
+                <w:sz w:val="17"/>
+              </w:rPr>
+              <w:t>Cobrar solo sobre la dotación activa promedio del mes.</w:t>
+            </w:r>
+          </w:p>
+        </w:tc>
+      </w:tr>
+      <w:tr>
+        <w:tc>
+          <w:tcPr>
+            <w:tcW w:type="dxa" w:w="3096"/>
             <w:shd w:fill="FFFFFF"/>
             <w:tcBorders>
               <w:top w:val="single" w:sz="8" w:color="E3DED2"/>
@@ -3819,13 +4575,13 @@
                 <w:color w:val="141A20"/>
                 <w:sz w:val="17"/>
               </w:rPr>
-              <w:t>Adicional: Libro de obra digital</w:t>
+              <w:t>Libro de obra digital</w:t>
             </w:r>
           </w:p>
         </w:tc>
         <w:tc>
           <w:tcPr>
-            <w:tcW w:type="dxa" w:w="4392"/>
+            <w:tcW w:type="dxa" w:w="2232"/>
             <w:shd w:fill="FFFFFF"/>
             <w:tcBorders>
               <w:top w:val="single" w:sz="8" w:color="E3DED2"/>
@@ -3847,13 +4603,13 @@
                 <w:color w:val="141A20"/>
                 <w:sz w:val="17"/>
               </w:rPr>
-              <w:t>Registro formal, folios, evidencias, compromisos y solicitudes de firma.</w:t>
+              <w:t>Desde $95.000 / mes</w:t>
             </w:r>
           </w:p>
         </w:tc>
         <w:tc>
           <w:tcPr>
-            <w:tcW w:type="dxa" w:w="2376"/>
+            <w:tcW w:type="dxa" w:w="5184"/>
             <w:shd w:fill="FFFFFF"/>
             <w:tcBorders>
               <w:top w:val="single" w:sz="8" w:color="E3DED2"/>
@@ -3875,13 +4631,101 @@
                 <w:color w:val="141A20"/>
                 <w:sz w:val="17"/>
               </w:rPr>
-              <w:t>Obras, montajes, servicios con hitos y trazabilidad contractual.</w:t>
+              <w:t>Adicional por empresa; firma electrónica y mensajes se cobran según consumo del proveedor.</w:t>
+            </w:r>
+          </w:p>
+        </w:tc>
+      </w:tr>
+      <w:tr>
+        <w:tc>
+          <w:tcPr>
+            <w:tcW w:type="dxa" w:w="3096"/>
+            <w:shd w:fill="FBF9F5"/>
+            <w:tcBorders>
+              <w:top w:val="single" w:sz="8" w:color="E3DED2"/>
+              <w:left w:val="single" w:sz="8" w:color="E3DED2"/>
+              <w:bottom w:val="single" w:sz="8" w:color="E3DED2"/>
+              <w:right w:val="single" w:sz="8" w:color="E3DED2"/>
+            </w:tcBorders>
+            <w:vAlign w:val="center"/>
+          </w:tcPr>
+          <w:p>
+            <w:pPr>
+              <w:spacing w:after="60" w:before="60"/>
+            </w:pPr>
+            <w:r/>
+            <w:r>
+              <w:rPr>
+                <w:rFonts w:ascii="Arial" w:hAnsi="Arial"/>
+                <w:b w:val="0"/>
+                <w:color w:val="141A20"/>
+                <w:sz w:val="17"/>
+              </w:rPr>
+              <w:t>Prospectos y oportunidades</w:t>
             </w:r>
           </w:p>
         </w:tc>
         <w:tc>
           <w:tcPr>
-            <w:tcW w:type="dxa" w:w="1944"/>
+            <w:tcW w:type="dxa" w:w="2232"/>
+            <w:shd w:fill="FBF9F5"/>
+            <w:tcBorders>
+              <w:top w:val="single" w:sz="8" w:color="E3DED2"/>
+              <w:left w:val="single" w:sz="8" w:color="E3DED2"/>
+              <w:bottom w:val="single" w:sz="8" w:color="E3DED2"/>
+              <w:right w:val="single" w:sz="8" w:color="E3DED2"/>
+            </w:tcBorders>
+            <w:vAlign w:val="center"/>
+          </w:tcPr>
+          <w:p>
+            <w:pPr>
+              <w:spacing w:after="60" w:before="60"/>
+            </w:pPr>
+            <w:r/>
+            <w:r>
+              <w:rPr>
+                <w:rFonts w:ascii="Arial" w:hAnsi="Arial"/>
+                <w:b w:val="0"/>
+                <w:color w:val="141A20"/>
+                <w:sz w:val="17"/>
+              </w:rPr>
+              <w:t>Desde $65.000 / mes</w:t>
+            </w:r>
+          </w:p>
+        </w:tc>
+        <w:tc>
+          <w:tcPr>
+            <w:tcW w:type="dxa" w:w="5184"/>
+            <w:shd w:fill="FBF9F5"/>
+            <w:tcBorders>
+              <w:top w:val="single" w:sz="8" w:color="E3DED2"/>
+              <w:left w:val="single" w:sz="8" w:color="E3DED2"/>
+              <w:bottom w:val="single" w:sz="8" w:color="E3DED2"/>
+              <w:right w:val="single" w:sz="8" w:color="E3DED2"/>
+            </w:tcBorders>
+            <w:vAlign w:val="center"/>
+          </w:tcPr>
+          <w:p>
+            <w:pPr>
+              <w:spacing w:after="60" w:before="60"/>
+            </w:pPr>
+            <w:r/>
+            <w:r>
+              <w:rPr>
+                <w:rFonts w:ascii="Arial" w:hAnsi="Arial"/>
+                <w:b w:val="0"/>
+                <w:color w:val="141A20"/>
+                <w:sz w:val="17"/>
+              </w:rPr>
+              <w:t>Adicional comercial para conectar preventa, seguimiento y conversión.</w:t>
+            </w:r>
+          </w:p>
+        </w:tc>
+      </w:tr>
+      <w:tr>
+        <w:tc>
+          <w:tcPr>
+            <w:tcW w:type="dxa" w:w="3096"/>
             <w:shd w:fill="FFFFFF"/>
             <w:tcBorders>
               <w:top w:val="single" w:sz="8" w:color="E3DED2"/>
@@ -3903,7 +4747,63 @@
                 <w:color w:val="141A20"/>
                 <w:sz w:val="17"/>
               </w:rPr>
-              <w:t>Cotizar por operación / proveedor de firma</w:t>
+              <w:t>Integración, API o desarrollo específico</w:t>
+            </w:r>
+          </w:p>
+        </w:tc>
+        <w:tc>
+          <w:tcPr>
+            <w:tcW w:type="dxa" w:w="2232"/>
+            <w:shd w:fill="FFFFFF"/>
+            <w:tcBorders>
+              <w:top w:val="single" w:sz="8" w:color="E3DED2"/>
+              <w:left w:val="single" w:sz="8" w:color="E3DED2"/>
+              <w:bottom w:val="single" w:sz="8" w:color="E3DED2"/>
+              <w:right w:val="single" w:sz="8" w:color="E3DED2"/>
+            </w:tcBorders>
+            <w:vAlign w:val="center"/>
+          </w:tcPr>
+          <w:p>
+            <w:pPr>
+              <w:spacing w:after="60" w:before="60"/>
+            </w:pPr>
+            <w:r/>
+            <w:r>
+              <w:rPr>
+                <w:rFonts w:ascii="Arial" w:hAnsi="Arial"/>
+                <w:b w:val="0"/>
+                <w:color w:val="141A20"/>
+                <w:sz w:val="17"/>
+              </w:rPr>
+              <w:t>Desde $450.000 único + soporte mensual según alcance</w:t>
+            </w:r>
+          </w:p>
+        </w:tc>
+        <w:tc>
+          <w:tcPr>
+            <w:tcW w:type="dxa" w:w="5184"/>
+            <w:shd w:fill="FFFFFF"/>
+            <w:tcBorders>
+              <w:top w:val="single" w:sz="8" w:color="E3DED2"/>
+              <w:left w:val="single" w:sz="8" w:color="E3DED2"/>
+              <w:bottom w:val="single" w:sz="8" w:color="E3DED2"/>
+              <w:right w:val="single" w:sz="8" w:color="E3DED2"/>
+            </w:tcBorders>
+            <w:vAlign w:val="center"/>
+          </w:tcPr>
+          <w:p>
+            <w:pPr>
+              <w:spacing w:after="60" w:before="60"/>
+            </w:pPr>
+            <w:r/>
+            <w:r>
+              <w:rPr>
+                <w:rFonts w:ascii="Arial" w:hAnsi="Arial"/>
+                <w:b w:val="0"/>
+                <w:color w:val="141A20"/>
+                <w:sz w:val="17"/>
+              </w:rPr>
+              <w:t>Se cotiza después de una sesión de descubrimiento y no se promete como estándar.</w:t>
             </w:r>
           </w:p>
         </w:tc>
@@ -3911,7 +4811,7 @@
       <w:tr>
         <w:tc>
           <w:tcPr>
-            <w:tcW w:type="dxa" w:w="1800"/>
+            <w:tcW w:type="dxa" w:w="3096"/>
             <w:shd w:fill="FBF9F5"/>
             <w:tcBorders>
               <w:top w:val="single" w:sz="8" w:color="E3DED2"/>
@@ -3933,13 +4833,13 @@
                 <w:color w:val="141A20"/>
                 <w:sz w:val="17"/>
               </w:rPr>
-              <w:t>Adicional: Prospectos y oportunidades</w:t>
+              <w:t>Almacenamiento extraordinario, OCR, firma o mensajería</w:t>
             </w:r>
           </w:p>
         </w:tc>
         <w:tc>
           <w:tcPr>
-            <w:tcW w:type="dxa" w:w="4392"/>
+            <w:tcW w:type="dxa" w:w="2232"/>
             <w:shd w:fill="FBF9F5"/>
             <w:tcBorders>
               <w:top w:val="single" w:sz="8" w:color="E3DED2"/>
@@ -3961,13 +4861,13 @@
                 <w:color w:val="141A20"/>
                 <w:sz w:val="17"/>
               </w:rPr>
-              <w:t>Embudo, bitácora comercial, archivos, probabilidad y conversión a cliente.</w:t>
+              <w:t>Costo de proveedor + administración Nexo Klar</w:t>
             </w:r>
           </w:p>
         </w:tc>
         <w:tc>
           <w:tcPr>
-            <w:tcW w:type="dxa" w:w="2376"/>
+            <w:tcW w:type="dxa" w:w="5184"/>
             <w:shd w:fill="FBF9F5"/>
             <w:tcBorders>
               <w:top w:val="single" w:sz="8" w:color="E3DED2"/>
@@ -3989,13 +4889,193 @@
                 <w:color w:val="141A20"/>
                 <w:sz w:val="17"/>
               </w:rPr>
-              <w:t>Empresas que buscan conectar venta y operación.</w:t>
+              <w:t>Se informa por separado antes de activar el servicio.</w:t>
+            </w:r>
+          </w:p>
+        </w:tc>
+      </w:tr>
+    </w:tbl>
+    <w:p>
+      <w:pPr>
+        <w:spacing w:after="40"/>
+      </w:pPr>
+    </w:p>
+    <w:p>
+      <w:pPr>
+        <w:spacing w:after="120" w:line="276" w:lineRule="auto"/>
+      </w:pPr>
+      <w:r>
+        <w:rPr>
+          <w:rFonts w:ascii="Arial" w:hAnsi="Arial"/>
+          <w:color w:val="141A20"/>
+          <w:sz w:val="20"/>
+        </w:rPr>
+        <w:t>Condición sugerida: contrato mínimo de 12 meses. Pago anual anticipado: 10% de descuento en la suscripción o bonificación parcial del onboarding, no ambos. Para clientes piloto, aplicar un descuento temporal y dejarlo expresamente limitado a los primeros 90 días.</w:t>
+      </w:r>
+    </w:p>
+    <w:p>
+      <w:r>
+        <w:br w:type="page"/>
+      </w:r>
+    </w:p>
+    <w:p>
+      <w:pPr>
+        <w:spacing w:after="120"/>
+      </w:pPr>
+      <w:r>
+        <w:rPr>
+          <w:rFonts w:ascii="Arial" w:hAnsi="Arial"/>
+          <w:b/>
+          <w:color w:val="141A20"/>
+          <w:sz w:val="48"/>
+        </w:rPr>
+        <w:t>8. Carga inicial y onboarding</w:t>
+      </w:r>
+    </w:p>
+    <w:p>
+      <w:pPr>
+        <w:spacing w:after="240"/>
+      </w:pPr>
+      <w:r>
+        <w:rPr>
+          <w:rFonts w:ascii="Arial" w:hAnsi="Arial"/>
+          <w:color w:val="5D6B7A"/>
+          <w:sz w:val="22"/>
+        </w:rPr>
+        <w:t>Alternativas claras para no regalar trabajo crítico</w:t>
+      </w:r>
+    </w:p>
+    <w:tbl>
+      <w:tblPr>
+        <w:tblW w:type="auto" w:w="0"/>
+        <w:jc w:val="center"/>
+        <w:tblLayout w:type="fixed"/>
+        <w:tblLook w:firstColumn="1" w:firstRow="1" w:lastColumn="0" w:lastRow="0" w:noHBand="0" w:noVBand="1" w:val="04A0"/>
+      </w:tblPr>
+      <w:tblGrid>
+        <w:gridCol w:w="1872"/>
+        <w:gridCol w:w="5400"/>
+        <w:gridCol w:w="1656"/>
+        <w:gridCol w:w="1584"/>
+      </w:tblGrid>
+      <w:tr>
+        <w:tc>
+          <w:tcPr>
+            <w:tcW w:type="dxa" w:w="2541"/>
+            <w:shd w:fill="1A1A5E"/>
+            <w:tcBorders>
+              <w:top w:val="single" w:sz="8" w:color="1A1A5E"/>
+              <w:left w:val="single" w:sz="8" w:color="1A1A5E"/>
+              <w:bottom w:val="single" w:sz="8" w:color="1A1A5E"/>
+              <w:right w:val="single" w:sz="8" w:color="1A1A5E"/>
+            </w:tcBorders>
+            <w:vAlign w:val="center"/>
+          </w:tcPr>
+          <w:p>
+            <w:pPr>
+              <w:spacing w:after="60" w:before="60"/>
+            </w:pPr>
+            <w:r/>
+            <w:r>
+              <w:rPr>
+                <w:rFonts w:ascii="Arial" w:hAnsi="Arial"/>
+                <w:b/>
+                <w:color w:val="FFFFFF"/>
+                <w:sz w:val="17"/>
+              </w:rPr>
+              <w:t>Alternativa</w:t>
             </w:r>
           </w:p>
         </w:tc>
         <w:tc>
           <w:tcPr>
-            <w:tcW w:type="dxa" w:w="1944"/>
+            <w:tcW w:type="dxa" w:w="2541"/>
+            <w:shd w:fill="1A1A5E"/>
+            <w:tcBorders>
+              <w:top w:val="single" w:sz="8" w:color="1A1A5E"/>
+              <w:left w:val="single" w:sz="8" w:color="1A1A5E"/>
+              <w:bottom w:val="single" w:sz="8" w:color="1A1A5E"/>
+              <w:right w:val="single" w:sz="8" w:color="1A1A5E"/>
+            </w:tcBorders>
+            <w:vAlign w:val="center"/>
+          </w:tcPr>
+          <w:p>
+            <w:pPr>
+              <w:spacing w:after="60" w:before="60"/>
+            </w:pPr>
+            <w:r/>
+            <w:r>
+              <w:rPr>
+                <w:rFonts w:ascii="Arial" w:hAnsi="Arial"/>
+                <w:b/>
+                <w:color w:val="FFFFFF"/>
+                <w:sz w:val="17"/>
+              </w:rPr>
+              <w:t>Alcance</w:t>
+            </w:r>
+          </w:p>
+        </w:tc>
+        <w:tc>
+          <w:tcPr>
+            <w:tcW w:type="dxa" w:w="2541"/>
+            <w:shd w:fill="1A1A5E"/>
+            <w:tcBorders>
+              <w:top w:val="single" w:sz="8" w:color="1A1A5E"/>
+              <w:left w:val="single" w:sz="8" w:color="1A1A5E"/>
+              <w:bottom w:val="single" w:sz="8" w:color="1A1A5E"/>
+              <w:right w:val="single" w:sz="8" w:color="1A1A5E"/>
+            </w:tcBorders>
+            <w:vAlign w:val="center"/>
+          </w:tcPr>
+          <w:p>
+            <w:pPr>
+              <w:spacing w:after="60" w:before="60"/>
+            </w:pPr>
+            <w:r/>
+            <w:r>
+              <w:rPr>
+                <w:rFonts w:ascii="Arial" w:hAnsi="Arial"/>
+                <w:b/>
+                <w:color w:val="FFFFFF"/>
+                <w:sz w:val="17"/>
+              </w:rPr>
+              <w:t>Precio neto CLP</w:t>
+            </w:r>
+          </w:p>
+        </w:tc>
+        <w:tc>
+          <w:tcPr>
+            <w:tcW w:type="dxa" w:w="2541"/>
+            <w:shd w:fill="1A1A5E"/>
+            <w:tcBorders>
+              <w:top w:val="single" w:sz="8" w:color="1A1A5E"/>
+              <w:left w:val="single" w:sz="8" w:color="1A1A5E"/>
+              <w:bottom w:val="single" w:sz="8" w:color="1A1A5E"/>
+              <w:right w:val="single" w:sz="8" w:color="1A1A5E"/>
+            </w:tcBorders>
+            <w:vAlign w:val="center"/>
+          </w:tcPr>
+          <w:p>
+            <w:pPr>
+              <w:spacing w:after="60" w:before="60"/>
+            </w:pPr>
+            <w:r/>
+            <w:r>
+              <w:rPr>
+                <w:rFonts w:ascii="Arial" w:hAnsi="Arial"/>
+                <w:b/>
+                <w:color w:val="FFFFFF"/>
+                <w:sz w:val="17"/>
+              </w:rPr>
+              <w:t>Cuándo ofrecerla</w:t>
+            </w:r>
+          </w:p>
+        </w:tc>
+      </w:tr>
+      <w:tr>
+        <w:tc>
+          <w:tcPr>
+            <w:tcW w:type="dxa" w:w="1872"/>
             <w:shd w:fill="FBF9F5"/>
             <w:tcBorders>
               <w:top w:val="single" w:sz="8" w:color="E3DED2"/>
@@ -4017,7 +5097,433 @@
                 <w:color w:val="141A20"/>
                 <w:sz w:val="17"/>
               </w:rPr>
-              <w:t>Cotizar por plan o usuario comercial</w:t>
+              <w:t>Autoguiada</w:t>
+            </w:r>
+          </w:p>
+        </w:tc>
+        <w:tc>
+          <w:tcPr>
+            <w:tcW w:type="dxa" w:w="5400"/>
+            <w:shd w:fill="FBF9F5"/>
+            <w:tcBorders>
+              <w:top w:val="single" w:sz="8" w:color="E3DED2"/>
+              <w:left w:val="single" w:sz="8" w:color="E3DED2"/>
+              <w:bottom w:val="single" w:sz="8" w:color="E3DED2"/>
+              <w:right w:val="single" w:sz="8" w:color="E3DED2"/>
+            </w:tcBorders>
+            <w:vAlign w:val="center"/>
+          </w:tcPr>
+          <w:p>
+            <w:pPr>
+              <w:spacing w:after="60" w:before="60"/>
+            </w:pPr>
+            <w:r/>
+            <w:r>
+              <w:rPr>
+                <w:rFonts w:ascii="Arial" w:hAnsi="Arial"/>
+                <w:b w:val="0"/>
+                <w:color w:val="141A20"/>
+                <w:sz w:val="17"/>
+              </w:rPr>
+              <w:t>Plantillas, centro de ayuda, sesión de inicio de 90 minutos y revisión de carga del cliente.</w:t>
+            </w:r>
+          </w:p>
+        </w:tc>
+        <w:tc>
+          <w:tcPr>
+            <w:tcW w:type="dxa" w:w="1656"/>
+            <w:shd w:fill="FBF9F5"/>
+            <w:tcBorders>
+              <w:top w:val="single" w:sz="8" w:color="E3DED2"/>
+              <w:left w:val="single" w:sz="8" w:color="E3DED2"/>
+              <w:bottom w:val="single" w:sz="8" w:color="E3DED2"/>
+              <w:right w:val="single" w:sz="8" w:color="E3DED2"/>
+            </w:tcBorders>
+            <w:vAlign w:val="center"/>
+          </w:tcPr>
+          <w:p>
+            <w:pPr>
+              <w:spacing w:after="60" w:before="60"/>
+            </w:pPr>
+            <w:r/>
+            <w:r>
+              <w:rPr>
+                <w:rFonts w:ascii="Arial" w:hAnsi="Arial"/>
+                <w:b w:val="0"/>
+                <w:color w:val="141A20"/>
+                <w:sz w:val="17"/>
+              </w:rPr>
+              <w:t>Sin costo en contrato anual; $120.000 en mensual.</w:t>
+            </w:r>
+          </w:p>
+        </w:tc>
+        <w:tc>
+          <w:tcPr>
+            <w:tcW w:type="dxa" w:w="1584"/>
+            <w:shd w:fill="FBF9F5"/>
+            <w:tcBorders>
+              <w:top w:val="single" w:sz="8" w:color="E3DED2"/>
+              <w:left w:val="single" w:sz="8" w:color="E3DED2"/>
+              <w:bottom w:val="single" w:sz="8" w:color="E3DED2"/>
+              <w:right w:val="single" w:sz="8" w:color="E3DED2"/>
+            </w:tcBorders>
+            <w:vAlign w:val="center"/>
+          </w:tcPr>
+          <w:p>
+            <w:pPr>
+              <w:spacing w:after="60" w:before="60"/>
+            </w:pPr>
+            <w:r/>
+            <w:r>
+              <w:rPr>
+                <w:rFonts w:ascii="Arial" w:hAnsi="Arial"/>
+                <w:b w:val="0"/>
+                <w:color w:val="141A20"/>
+                <w:sz w:val="17"/>
+              </w:rPr>
+              <w:t>Empresa pequeña, datos ordenados y administrador disponible.</w:t>
+            </w:r>
+          </w:p>
+        </w:tc>
+      </w:tr>
+      <w:tr>
+        <w:tc>
+          <w:tcPr>
+            <w:tcW w:type="dxa" w:w="1872"/>
+            <w:shd w:fill="FFFFFF"/>
+            <w:tcBorders>
+              <w:top w:val="single" w:sz="8" w:color="E3DED2"/>
+              <w:left w:val="single" w:sz="8" w:color="E3DED2"/>
+              <w:bottom w:val="single" w:sz="8" w:color="E3DED2"/>
+              <w:right w:val="single" w:sz="8" w:color="E3DED2"/>
+            </w:tcBorders>
+            <w:vAlign w:val="center"/>
+          </w:tcPr>
+          <w:p>
+            <w:pPr>
+              <w:spacing w:after="60" w:before="60"/>
+            </w:pPr>
+            <w:r/>
+            <w:r>
+              <w:rPr>
+                <w:rFonts w:ascii="Arial" w:hAnsi="Arial"/>
+                <w:b w:val="0"/>
+                <w:color w:val="141A20"/>
+                <w:sz w:val="17"/>
+              </w:rPr>
+              <w:t>Asistida</w:t>
+            </w:r>
+          </w:p>
+        </w:tc>
+        <w:tc>
+          <w:tcPr>
+            <w:tcW w:type="dxa" w:w="5400"/>
+            <w:shd w:fill="FFFFFF"/>
+            <w:tcBorders>
+              <w:top w:val="single" w:sz="8" w:color="E3DED2"/>
+              <w:left w:val="single" w:sz="8" w:color="E3DED2"/>
+              <w:bottom w:val="single" w:sz="8" w:color="E3DED2"/>
+              <w:right w:val="single" w:sz="8" w:color="E3DED2"/>
+            </w:tcBorders>
+            <w:vAlign w:val="center"/>
+          </w:tcPr>
+          <w:p>
+            <w:pPr>
+              <w:spacing w:after="60" w:before="60"/>
+            </w:pPr>
+            <w:r/>
+            <w:r>
+              <w:rPr>
+                <w:rFonts w:ascii="Arial" w:hAnsi="Arial"/>
+                <w:b w:val="0"/>
+                <w:color w:val="141A20"/>
+                <w:sz w:val="17"/>
+              </w:rPr>
+              <w:t>Configuración base, carga de hasta 50 personas, 2 clientes, 3 contratos/órdenes, importación CSV y 2 sesiones de capacitación.</w:t>
+            </w:r>
+          </w:p>
+        </w:tc>
+        <w:tc>
+          <w:tcPr>
+            <w:tcW w:type="dxa" w:w="1656"/>
+            <w:shd w:fill="FFFFFF"/>
+            <w:tcBorders>
+              <w:top w:val="single" w:sz="8" w:color="E3DED2"/>
+              <w:left w:val="single" w:sz="8" w:color="E3DED2"/>
+              <w:bottom w:val="single" w:sz="8" w:color="E3DED2"/>
+              <w:right w:val="single" w:sz="8" w:color="E3DED2"/>
+            </w:tcBorders>
+            <w:vAlign w:val="center"/>
+          </w:tcPr>
+          <w:p>
+            <w:pPr>
+              <w:spacing w:after="60" w:before="60"/>
+            </w:pPr>
+            <w:r/>
+            <w:r>
+              <w:rPr>
+                <w:rFonts w:ascii="Arial" w:hAnsi="Arial"/>
+                <w:b w:val="0"/>
+                <w:color w:val="141A20"/>
+                <w:sz w:val="17"/>
+              </w:rPr>
+              <w:t>$390.000 único</w:t>
+            </w:r>
+          </w:p>
+        </w:tc>
+        <w:tc>
+          <w:tcPr>
+            <w:tcW w:type="dxa" w:w="1584"/>
+            <w:shd w:fill="FFFFFF"/>
+            <w:tcBorders>
+              <w:top w:val="single" w:sz="8" w:color="E3DED2"/>
+              <w:left w:val="single" w:sz="8" w:color="E3DED2"/>
+              <w:bottom w:val="single" w:sz="8" w:color="E3DED2"/>
+              <w:right w:val="single" w:sz="8" w:color="E3DED2"/>
+            </w:tcBorders>
+            <w:vAlign w:val="center"/>
+          </w:tcPr>
+          <w:p>
+            <w:pPr>
+              <w:spacing w:after="60" w:before="60"/>
+            </w:pPr>
+            <w:r/>
+            <w:r>
+              <w:rPr>
+                <w:rFonts w:ascii="Arial" w:hAnsi="Arial"/>
+                <w:b w:val="0"/>
+                <w:color w:val="141A20"/>
+                <w:sz w:val="17"/>
+              </w:rPr>
+              <w:t>Oferta estándar para la mayoría de empresas de servicios.</w:t>
+            </w:r>
+          </w:p>
+        </w:tc>
+      </w:tr>
+      <w:tr>
+        <w:tc>
+          <w:tcPr>
+            <w:tcW w:type="dxa" w:w="1872"/>
+            <w:shd w:fill="FBF9F5"/>
+            <w:tcBorders>
+              <w:top w:val="single" w:sz="8" w:color="E3DED2"/>
+              <w:left w:val="single" w:sz="8" w:color="E3DED2"/>
+              <w:bottom w:val="single" w:sz="8" w:color="E3DED2"/>
+              <w:right w:val="single" w:sz="8" w:color="E3DED2"/>
+            </w:tcBorders>
+            <w:vAlign w:val="center"/>
+          </w:tcPr>
+          <w:p>
+            <w:pPr>
+              <w:spacing w:after="60" w:before="60"/>
+            </w:pPr>
+            <w:r/>
+            <w:r>
+              <w:rPr>
+                <w:rFonts w:ascii="Arial" w:hAnsi="Arial"/>
+                <w:b w:val="0"/>
+                <w:color w:val="141A20"/>
+                <w:sz w:val="17"/>
+              </w:rPr>
+              <w:t>Operacional</w:t>
+            </w:r>
+          </w:p>
+        </w:tc>
+        <w:tc>
+          <w:tcPr>
+            <w:tcW w:type="dxa" w:w="5400"/>
+            <w:shd w:fill="FBF9F5"/>
+            <w:tcBorders>
+              <w:top w:val="single" w:sz="8" w:color="E3DED2"/>
+              <w:left w:val="single" w:sz="8" w:color="E3DED2"/>
+              <w:bottom w:val="single" w:sz="8" w:color="E3DED2"/>
+              <w:right w:val="single" w:sz="8" w:color="E3DED2"/>
+            </w:tcBorders>
+            <w:vAlign w:val="center"/>
+          </w:tcPr>
+          <w:p>
+            <w:pPr>
+              <w:spacing w:after="60" w:before="60"/>
+            </w:pPr>
+            <w:r/>
+            <w:r>
+              <w:rPr>
+                <w:rFonts w:ascii="Arial" w:hAnsi="Arial"/>
+                <w:b w:val="0"/>
+                <w:color w:val="141A20"/>
+                <w:sz w:val="17"/>
+              </w:rPr>
+              <w:t>Catálogos, matriz inicial, carga de hasta 150 personas, 5 clientes, 10 contratos/órdenes, recursos y 4 sesiones de capacitación.</w:t>
+            </w:r>
+          </w:p>
+        </w:tc>
+        <w:tc>
+          <w:tcPr>
+            <w:tcW w:type="dxa" w:w="1656"/>
+            <w:shd w:fill="FBF9F5"/>
+            <w:tcBorders>
+              <w:top w:val="single" w:sz="8" w:color="E3DED2"/>
+              <w:left w:val="single" w:sz="8" w:color="E3DED2"/>
+              <w:bottom w:val="single" w:sz="8" w:color="E3DED2"/>
+              <w:right w:val="single" w:sz="8" w:color="E3DED2"/>
+            </w:tcBorders>
+            <w:vAlign w:val="center"/>
+          </w:tcPr>
+          <w:p>
+            <w:pPr>
+              <w:spacing w:after="60" w:before="60"/>
+            </w:pPr>
+            <w:r/>
+            <w:r>
+              <w:rPr>
+                <w:rFonts w:ascii="Arial" w:hAnsi="Arial"/>
+                <w:b w:val="0"/>
+                <w:color w:val="141A20"/>
+                <w:sz w:val="17"/>
+              </w:rPr>
+              <w:t>$790.000 único</w:t>
+            </w:r>
+          </w:p>
+        </w:tc>
+        <w:tc>
+          <w:tcPr>
+            <w:tcW w:type="dxa" w:w="1584"/>
+            <w:shd w:fill="FBF9F5"/>
+            <w:tcBorders>
+              <w:top w:val="single" w:sz="8" w:color="E3DED2"/>
+              <w:left w:val="single" w:sz="8" w:color="E3DED2"/>
+              <w:bottom w:val="single" w:sz="8" w:color="E3DED2"/>
+              <w:right w:val="single" w:sz="8" w:color="E3DED2"/>
+            </w:tcBorders>
+            <w:vAlign w:val="center"/>
+          </w:tcPr>
+          <w:p>
+            <w:pPr>
+              <w:spacing w:after="60" w:before="60"/>
+            </w:pPr>
+            <w:r/>
+            <w:r>
+              <w:rPr>
+                <w:rFonts w:ascii="Arial" w:hAnsi="Arial"/>
+                <w:b w:val="0"/>
+                <w:color w:val="141A20"/>
+                <w:sz w:val="17"/>
+              </w:rPr>
+              <w:t>Cliente con varias operaciones, personal temporal o necesidad de partir rápido.</w:t>
+            </w:r>
+          </w:p>
+        </w:tc>
+      </w:tr>
+      <w:tr>
+        <w:tc>
+          <w:tcPr>
+            <w:tcW w:type="dxa" w:w="1872"/>
+            <w:shd w:fill="FFFFFF"/>
+            <w:tcBorders>
+              <w:top w:val="single" w:sz="8" w:color="E3DED2"/>
+              <w:left w:val="single" w:sz="8" w:color="E3DED2"/>
+              <w:bottom w:val="single" w:sz="8" w:color="E3DED2"/>
+              <w:right w:val="single" w:sz="8" w:color="E3DED2"/>
+            </w:tcBorders>
+            <w:vAlign w:val="center"/>
+          </w:tcPr>
+          <w:p>
+            <w:pPr>
+              <w:spacing w:after="60" w:before="60"/>
+            </w:pPr>
+            <w:r/>
+            <w:r>
+              <w:rPr>
+                <w:rFonts w:ascii="Arial" w:hAnsi="Arial"/>
+                <w:b w:val="0"/>
+                <w:color w:val="141A20"/>
+                <w:sz w:val="17"/>
+              </w:rPr>
+              <w:t>Corporativa</w:t>
+            </w:r>
+          </w:p>
+        </w:tc>
+        <w:tc>
+          <w:tcPr>
+            <w:tcW w:type="dxa" w:w="5400"/>
+            <w:shd w:fill="FFFFFF"/>
+            <w:tcBorders>
+              <w:top w:val="single" w:sz="8" w:color="E3DED2"/>
+              <w:left w:val="single" w:sz="8" w:color="E3DED2"/>
+              <w:bottom w:val="single" w:sz="8" w:color="E3DED2"/>
+              <w:right w:val="single" w:sz="8" w:color="E3DED2"/>
+            </w:tcBorders>
+            <w:vAlign w:val="center"/>
+          </w:tcPr>
+          <w:p>
+            <w:pPr>
+              <w:spacing w:after="60" w:before="60"/>
+            </w:pPr>
+            <w:r/>
+            <w:r>
+              <w:rPr>
+                <w:rFonts w:ascii="Arial" w:hAnsi="Arial"/>
+                <w:b w:val="0"/>
+                <w:color w:val="141A20"/>
+                <w:sz w:val="17"/>
+              </w:rPr>
+              <w:t>Diagnóstico, depuración de datos, migración mayor, roles, identidad visual, capacitación por equipo y plan de adopción.</w:t>
+            </w:r>
+          </w:p>
+        </w:tc>
+        <w:tc>
+          <w:tcPr>
+            <w:tcW w:type="dxa" w:w="1656"/>
+            <w:shd w:fill="FFFFFF"/>
+            <w:tcBorders>
+              <w:top w:val="single" w:sz="8" w:color="E3DED2"/>
+              <w:left w:val="single" w:sz="8" w:color="E3DED2"/>
+              <w:bottom w:val="single" w:sz="8" w:color="E3DED2"/>
+              <w:right w:val="single" w:sz="8" w:color="E3DED2"/>
+            </w:tcBorders>
+            <w:vAlign w:val="center"/>
+          </w:tcPr>
+          <w:p>
+            <w:pPr>
+              <w:spacing w:after="60" w:before="60"/>
+            </w:pPr>
+            <w:r/>
+            <w:r>
+              <w:rPr>
+                <w:rFonts w:ascii="Arial" w:hAnsi="Arial"/>
+                <w:b w:val="0"/>
+                <w:color w:val="141A20"/>
+                <w:sz w:val="17"/>
+              </w:rPr>
+              <w:t>Desde $1.500.000 + alcance</w:t>
+            </w:r>
+          </w:p>
+        </w:tc>
+        <w:tc>
+          <w:tcPr>
+            <w:tcW w:type="dxa" w:w="1584"/>
+            <w:shd w:fill="FFFFFF"/>
+            <w:tcBorders>
+              <w:top w:val="single" w:sz="8" w:color="E3DED2"/>
+              <w:left w:val="single" w:sz="8" w:color="E3DED2"/>
+              <w:bottom w:val="single" w:sz="8" w:color="E3DED2"/>
+              <w:right w:val="single" w:sz="8" w:color="E3DED2"/>
+            </w:tcBorders>
+            <w:vAlign w:val="center"/>
+          </w:tcPr>
+          <w:p>
+            <w:pPr>
+              <w:spacing w:after="60" w:before="60"/>
+            </w:pPr>
+            <w:r/>
+            <w:r>
+              <w:rPr>
+                <w:rFonts w:ascii="Arial" w:hAnsi="Arial"/>
+                <w:b w:val="0"/>
+                <w:color w:val="141A20"/>
+                <w:sz w:val="17"/>
+              </w:rPr>
+              <w:t>Empresa multioperación, alto volumen o requerimientos particulares.</w:t>
             </w:r>
           </w:p>
         </w:tc>
@@ -4030,15 +5536,127 @@
     </w:p>
     <w:p>
       <w:pPr>
-        <w:spacing w:after="120" w:line="276" w:lineRule="auto"/>
+        <w:pStyle w:val="ListBullet"/>
+        <w:spacing w:after="60"/>
+        <w:ind w:left="360"/>
       </w:pPr>
       <w:r>
         <w:rPr>
           <w:rFonts w:ascii="Arial" w:hAnsi="Arial"/>
           <w:color w:val="141A20"/>
-          <w:sz w:val="20"/>
+          <w:sz w:val="19"/>
         </w:rPr>
-        <w:t>Los precios son hipótesis comerciales iniciales para entrevistas y pilotos; deben ajustarse por número de personas, servicios activos, almacenamiento, acompañamiento, integraciones y nivel de soporte.</w:t>
+        <w:t>Alternativa de cierre: descontar hasta el 50% del onboarding asistido u operacional contra el primer año pagado por anticipado. Evita que la carga inicial parezca una barrera, sin eliminar su valor.</w:t>
+      </w:r>
+    </w:p>
+    <w:p>
+      <w:pPr>
+        <w:pStyle w:val="ListBullet"/>
+        <w:spacing w:after="60"/>
+        <w:ind w:left="360"/>
+      </w:pPr>
+      <w:r>
+        <w:rPr>
+          <w:rFonts w:ascii="Arial" w:hAnsi="Arial"/>
+          <w:color w:val="141A20"/>
+          <w:sz w:val="19"/>
+        </w:rPr>
+        <w:t>Piloto recomendado: 60 días pagados a $250.000, acreditables al 100% a la implementación si se contrata un plan anual. No ofrecer pilotos ilimitados ni cargas masivas gratis.</w:t>
+      </w:r>
+    </w:p>
+    <w:p>
+      <w:pPr>
+        <w:pStyle w:val="ListBullet"/>
+        <w:spacing w:after="60"/>
+        <w:ind w:left="360"/>
+      </w:pPr>
+      <w:r>
+        <w:rPr>
+          <w:rFonts w:ascii="Arial" w:hAnsi="Arial"/>
+          <w:color w:val="141A20"/>
+          <w:sz w:val="19"/>
+        </w:rPr>
+        <w:t>La carga histórica, corrección de datos, parametrizaciones especiales e integraciones deben quedar fuera del precio base y documentarse en una orden de trabajo.</w:t>
+      </w:r>
+    </w:p>
+    <w:tbl>
+      <w:tblPr>
+        <w:tblW w:type="auto" w:w="0"/>
+        <w:jc w:val="center"/>
+        <w:tblLayout w:type="fixed"/>
+        <w:tblLook w:firstColumn="1" w:firstRow="1" w:lastColumn="0" w:lastRow="0" w:noHBand="0" w:noVBand="1" w:val="04A0"/>
+      </w:tblPr>
+      <w:tblGrid>
+        <w:gridCol w:w="1944"/>
+        <w:gridCol w:w="8280"/>
+      </w:tblGrid>
+      <w:tr>
+        <w:tc>
+          <w:tcPr>
+            <w:tcW w:type="dxa" w:w="5083"/>
+            <w:shd w:fill="EAFBF9"/>
+            <w:tcBorders>
+              <w:top w:val="single" w:sz="8" w:color="BDEDE8"/>
+              <w:left w:val="single" w:sz="8" w:color="BDEDE8"/>
+              <w:bottom w:val="single" w:sz="8" w:color="BDEDE8"/>
+              <w:right w:val="single" w:sz="8" w:color="BDEDE8"/>
+            </w:tcBorders>
+            <w:vAlign w:val="center"/>
+          </w:tcPr>
+          <w:p>
+            <w:pPr>
+              <w:spacing w:after="60" w:before="60"/>
+            </w:pPr>
+            <w:r/>
+            <w:r>
+              <w:rPr>
+                <w:rFonts w:ascii="Arial" w:hAnsi="Arial"/>
+                <w:b/>
+                <w:color w:val="00706A"/>
+                <w:sz w:val="18"/>
+              </w:rPr>
+              <w:t>Forma de vender la carga inicial</w:t>
+            </w:r>
+          </w:p>
+        </w:tc>
+        <w:tc>
+          <w:tcPr>
+            <w:tcW w:type="dxa" w:w="5083"/>
+            <w:shd w:fill="EAFBF9"/>
+            <w:tcBorders>
+              <w:top w:val="single" w:sz="8" w:color="BDEDE8"/>
+              <w:left w:val="single" w:sz="8" w:color="BDEDE8"/>
+              <w:bottom w:val="single" w:sz="8" w:color="BDEDE8"/>
+              <w:right w:val="single" w:sz="8" w:color="BDEDE8"/>
+            </w:tcBorders>
+            <w:vAlign w:val="center"/>
+          </w:tcPr>
+          <w:p>
+            <w:pPr>
+              <w:spacing w:after="60" w:before="60"/>
+            </w:pPr>
+            <w:r/>
+            <w:r>
+              <w:rPr>
+                <w:rFonts w:ascii="Arial" w:hAnsi="Arial"/>
+                <w:b w:val="0"/>
+                <w:color w:val="141A20"/>
+                <w:sz w:val="18"/>
+              </w:rPr>
+              <w:t>“Ustedes pueden cargar con plantillas y guía, o podemos dejar una operación real lista para trabajar. La diferencia es el alcance, el tiempo y el acompañamiento; la plataforma sigue siendo la misma.”</w:t>
+            </w:r>
+          </w:p>
+        </w:tc>
+      </w:tr>
+    </w:tbl>
+    <w:p>
+      <w:pPr>
+        <w:spacing w:after="20"/>
+      </w:pPr>
+    </w:p>
+    <w:p>
+      <w:r>
+        <w:br w:type="page"/>
       </w:r>
     </w:p>
     <w:p>
@@ -4052,7 +5670,7 @@
           <w:color w:val="141A20"/>
           <w:sz w:val="48"/>
         </w:rPr>
-        <w:t>7. Estrategia de ventas</w:t>
+        <w:t>9. Estrategia de ventas</w:t>
       </w:r>
     </w:p>
     <w:p>
@@ -4774,7 +6392,7 @@
           <w:color w:val="141A20"/>
           <w:sz w:val="48"/>
         </w:rPr>
-        <w:t>8. Plan de marketing de 90 días</w:t>
+        <w:t>10. Plan de marketing de 90 días</w:t>
       </w:r>
     </w:p>
     <w:p>
@@ -5213,7 +6831,7 @@
           <w:color w:val="141A20"/>
           <w:sz w:val="48"/>
         </w:rPr>
-        <w:t>9. Métricas de venta y adopción</w:t>
+        <w:t>11. Métricas de venta y adopción</w:t>
       </w:r>
     </w:p>
     <w:p>
@@ -6107,7 +7725,7 @@
           <w:color w:val="141A20"/>
           <w:sz w:val="48"/>
         </w:rPr>
-        <w:t>10. Riesgos comerciales y cómo manejarlos</w:t>
+        <w:t>12. Riesgos comerciales y cómo manejarlos</w:t>
       </w:r>
     </w:p>
     <w:p>
@@ -6632,7 +8250,7 @@
           <w:color w:val="141A20"/>
           <w:sz w:val="48"/>
         </w:rPr>
-        <w:t>11. Próximos pasos de dirección</w:t>
+        <w:t>13. Próximos pasos de dirección</w:t>
       </w:r>
     </w:p>
     <w:p>
@@ -6839,7 +8457,7 @@
           <w:color w:val="141A20"/>
           <w:sz w:val="19"/>
         </w:rPr>
-        <w:t>HabiPass: gestión de cumplimiento documental para contratistas en Chile.</w:t>
+        <w:t>FieldPulse, página de precios: modelo por usuario, cotización por paquete y complementos operacionales (fieldpulse.com/pricing).</w:t>
       </w:r>
     </w:p>
     <w:p>
@@ -6854,7 +8472,7 @@
           <w:color w:val="141A20"/>
           <w:sz w:val="19"/>
         </w:rPr>
-        <w:t>Verify, SubCheck, PreveSafe y Fácil Control: control documental, subcontratación, alertas y trazabilidad de contratistas.</w:t>
+        <w:t>Housecall Pro, página de precios: plan de entrada publicado desde USD 59/mes y acompañamiento especializado en niveles altos (housecallpro.com/pricing).</w:t>
       </w:r>
     </w:p>
     <w:p>
@@ -6869,7 +8487,7 @@
           <w:color w:val="141A20"/>
           <w:sz w:val="19"/>
         </w:rPr>
-        <w:t>Praxedo: gestión de servicios técnicos en terreno, cuadrillas y operación de field service.</w:t>
+        <w:t>ServiceM8, página de precios: alternativas de inicio autoguiado o implementación/capacitación con socios (servicem8.com/pricing).</w:t>
       </w:r>
     </w:p>
     <w:p>
@@ -6884,7 +8502,7 @@
           <w:color w:val="141A20"/>
           <w:sz w:val="19"/>
         </w:rPr>
-        <w:t>PlanningP3 y Worklite: operación, mantenimiento, inspecciones, prevención y contratistas.</w:t>
+        <w:t>Codelco SUCAL, SmartCheck, SubCheck, Fácil Control, Vigenty y Documental.cl: referencias locales para acreditación, contratistas, trabajadores, vehículos y matrices de cumplimiento.</w:t>
       </w:r>
     </w:p>
     <w:p>
@@ -6899,7 +8517,7 @@
           <w:color w:val="141A20"/>
           <w:sz w:val="19"/>
         </w:rPr>
-        <w:t>Los precios del documento son una propuesta comercial de Nexo Klar y no una reproducción de tarifas de terceros.</w:t>
+        <w:t>Los valores en pesos chilenos de este documento son una propuesta comercial de Nexo Klar, no una reproducción de tarifas de terceros; se deben validar con clientes piloto y costos de soporte/cloud reales.</w:t>
       </w:r>
     </w:p>
     <w:sectPr>

</xml_diff>

<commit_message>
docs: improve SaaS pricing presentation
</commit_message>
<xml_diff>
--- a/docs/Plan_Comercial_Nexo_Klar_2026_2027.docx
+++ b/docs/Plan_Comercial_Nexo_Klar_2026_2027.docx
@@ -3865,6 +3865,11 @@
       </w:pPr>
     </w:p>
     <w:p>
+      <w:r>
+        <w:br w:type="page"/>
+      </w:r>
+    </w:p>
+    <w:p>
       <w:pPr>
         <w:spacing w:after="120"/>
       </w:pPr>
@@ -3891,6 +3896,19 @@
         <w:t>Tres planes claros, escalables y negociables</w:t>
       </w:r>
     </w:p>
+    <w:p>
+      <w:pPr>
+        <w:spacing w:after="120" w:line="276" w:lineRule="auto"/>
+      </w:pPr>
+      <w:r>
+        <w:rPr>
+          <w:rFonts w:ascii="Arial" w:hAnsi="Arial"/>
+          <w:color w:val="141A20"/>
+          <w:sz w:val="20"/>
+        </w:rPr>
+        <w:t>Los precios se definieron con una lógica de valor: Nexo Klar no reemplaza una pantalla aislada, sino que conecta relación comercial, personas, cumplimiento, recursos, ejecución y control. La tarifa se ajusta por dotación activa y complejidad operacional, no por cantidad de pantallas abiertas.</w:t>
+      </w:r>
+    </w:p>
     <w:tbl>
       <w:tblPr>
         <w:tblW w:type="auto" w:w="0"/>
@@ -3899,15 +3917,17 @@
         <w:tblLook w:firstColumn="1" w:firstRow="1" w:lastColumn="0" w:lastRow="0" w:noHBand="0" w:noVBand="1" w:val="04A0"/>
       </w:tblPr>
       <w:tblGrid>
-        <w:gridCol w:w="1944"/>
-        <w:gridCol w:w="4968"/>
-        <w:gridCol w:w="1728"/>
-        <w:gridCol w:w="1872"/>
+        <w:gridCol w:w="2232"/>
+        <w:gridCol w:w="7992"/>
       </w:tblGrid>
       <w:tr>
+        <w:trPr>
+          <w:cantSplit/>
+        </w:trPr>
         <w:tc>
           <w:tcPr>
-            <w:tcW w:type="dxa" w:w="2541"/>
+            <w:tcW w:type="dxa" w:w="10166"/>
+            <w:gridSpan w:val="2"/>
             <w:shd w:fill="1A1A5E"/>
             <w:tcBorders>
               <w:top w:val="single" w:sz="8" w:color="1A1A5E"/>
@@ -3927,21 +3947,26 @@
                 <w:rFonts w:ascii="Arial" w:hAnsi="Arial"/>
                 <w:b/>
                 <w:color w:val="FFFFFF"/>
-                <w:sz w:val="17"/>
+                <w:sz w:val="24"/>
               </w:rPr>
-              <w:t>Plan</w:t>
+              <w:t>Nexo Klar Base  |  $249.000 / mes</w:t>
             </w:r>
           </w:p>
         </w:tc>
+      </w:tr>
+      <w:tr>
+        <w:trPr>
+          <w:cantSplit/>
+        </w:trPr>
         <w:tc>
           <w:tcPr>
-            <w:tcW w:type="dxa" w:w="2541"/>
-            <w:shd w:fill="1A1A5E"/>
+            <w:tcW w:type="dxa" w:w="2232"/>
+            <w:shd w:fill="F0F0FA"/>
             <w:tcBorders>
-              <w:top w:val="single" w:sz="8" w:color="1A1A5E"/>
-              <w:left w:val="single" w:sz="8" w:color="1A1A5E"/>
-              <w:bottom w:val="single" w:sz="8" w:color="1A1A5E"/>
-              <w:right w:val="single" w:sz="8" w:color="1A1A5E"/>
+              <w:top w:val="single" w:sz="8" w:color="E3DED2"/>
+              <w:left w:val="single" w:sz="8" w:color="E3DED2"/>
+              <w:bottom w:val="single" w:sz="8" w:color="E3DED2"/>
+              <w:right w:val="single" w:sz="8" w:color="E3DED2"/>
             </w:tcBorders>
             <w:vAlign w:val="center"/>
           </w:tcPr>
@@ -3954,75 +3979,17 @@
               <w:rPr>
                 <w:rFonts w:ascii="Arial" w:hAnsi="Arial"/>
                 <w:b/>
-                <w:color w:val="FFFFFF"/>
+                <w:color w:val="1A1A5E"/>
                 <w:sz w:val="17"/>
               </w:rPr>
-              <w:t>Incluye</w:t>
+              <w:t>Enfoque</w:t>
             </w:r>
           </w:p>
         </w:tc>
         <w:tc>
           <w:tcPr>
-            <w:tcW w:type="dxa" w:w="2541"/>
-            <w:shd w:fill="1A1A5E"/>
-            <w:tcBorders>
-              <w:top w:val="single" w:sz="8" w:color="1A1A5E"/>
-              <w:left w:val="single" w:sz="8" w:color="1A1A5E"/>
-              <w:bottom w:val="single" w:sz="8" w:color="1A1A5E"/>
-              <w:right w:val="single" w:sz="8" w:color="1A1A5E"/>
-            </w:tcBorders>
-            <w:vAlign w:val="center"/>
-          </w:tcPr>
-          <w:p>
-            <w:pPr>
-              <w:spacing w:after="60" w:before="60"/>
-            </w:pPr>
-            <w:r/>
-            <w:r>
-              <w:rPr>
-                <w:rFonts w:ascii="Arial" w:hAnsi="Arial"/>
-                <w:b/>
-                <w:color w:val="FFFFFF"/>
-                <w:sz w:val="17"/>
-              </w:rPr>
-              <w:t>Escala incluida</w:t>
-            </w:r>
-          </w:p>
-        </w:tc>
-        <w:tc>
-          <w:tcPr>
-            <w:tcW w:type="dxa" w:w="2541"/>
-            <w:shd w:fill="1A1A5E"/>
-            <w:tcBorders>
-              <w:top w:val="single" w:sz="8" w:color="1A1A5E"/>
-              <w:left w:val="single" w:sz="8" w:color="1A1A5E"/>
-              <w:bottom w:val="single" w:sz="8" w:color="1A1A5E"/>
-              <w:right w:val="single" w:sz="8" w:color="1A1A5E"/>
-            </w:tcBorders>
-            <w:vAlign w:val="center"/>
-          </w:tcPr>
-          <w:p>
-            <w:pPr>
-              <w:spacing w:after="60" w:before="60"/>
-            </w:pPr>
-            <w:r/>
-            <w:r>
-              <w:rPr>
-                <w:rFonts w:ascii="Arial" w:hAnsi="Arial"/>
-                <w:b/>
-                <w:color w:val="FFFFFF"/>
-                <w:sz w:val="17"/>
-              </w:rPr>
-              <w:t>Precio lista neto CLP</w:t>
-            </w:r>
-          </w:p>
-        </w:tc>
-      </w:tr>
-      <w:tr>
-        <w:tc>
-          <w:tcPr>
-            <w:tcW w:type="dxa" w:w="1944"/>
-            <w:shd w:fill="FBF9F5"/>
+            <w:tcW w:type="dxa" w:w="7992"/>
+            <w:shd w:fill="FFFFFF"/>
             <w:tcBorders>
               <w:top w:val="single" w:sz="8" w:color="E3DED2"/>
               <w:left w:val="single" w:sz="8" w:color="E3DED2"/>
@@ -4043,14 +4010,108 @@
                 <w:color w:val="141A20"/>
                 <w:sz w:val="17"/>
               </w:rPr>
-              <w:t>Nexo Klar Base</w:t>
+              <w:t>Ordenar la operación y dejar de depender de planillas.</w:t>
+            </w:r>
+          </w:p>
+        </w:tc>
+      </w:tr>
+      <w:tr>
+        <w:trPr>
+          <w:cantSplit/>
+        </w:trPr>
+        <w:tc>
+          <w:tcPr>
+            <w:tcW w:type="dxa" w:w="2232"/>
+            <w:shd w:fill="F0F0FA"/>
+            <w:tcBorders>
+              <w:top w:val="single" w:sz="8" w:color="E3DED2"/>
+              <w:left w:val="single" w:sz="8" w:color="E3DED2"/>
+              <w:bottom w:val="single" w:sz="8" w:color="E3DED2"/>
+              <w:right w:val="single" w:sz="8" w:color="E3DED2"/>
+            </w:tcBorders>
+            <w:vAlign w:val="center"/>
+          </w:tcPr>
+          <w:p>
+            <w:pPr>
+              <w:spacing w:after="60" w:before="60"/>
+            </w:pPr>
+            <w:r/>
+            <w:r>
+              <w:rPr>
+                <w:rFonts w:ascii="Arial" w:hAnsi="Arial"/>
+                <w:b/>
+                <w:color w:val="1A1A5E"/>
+                <w:sz w:val="17"/>
+              </w:rPr>
+              <w:t>Escala incluida</w:t>
             </w:r>
           </w:p>
         </w:tc>
         <w:tc>
           <w:tcPr>
-            <w:tcW w:type="dxa" w:w="4968"/>
-            <w:shd w:fill="FBF9F5"/>
+            <w:tcW w:type="dxa" w:w="7992"/>
+            <w:shd w:fill="FFFFFF"/>
+            <w:tcBorders>
+              <w:top w:val="single" w:sz="8" w:color="E3DED2"/>
+              <w:left w:val="single" w:sz="8" w:color="E3DED2"/>
+              <w:bottom w:val="single" w:sz="8" w:color="E3DED2"/>
+              <w:right w:val="single" w:sz="8" w:color="E3DED2"/>
+            </w:tcBorders>
+            <w:vAlign w:val="center"/>
+          </w:tcPr>
+          <w:p>
+            <w:pPr>
+              <w:spacing w:after="60" w:before="60"/>
+            </w:pPr>
+            <w:r/>
+            <w:r>
+              <w:rPr>
+                <w:rFonts w:ascii="Arial" w:hAnsi="Arial"/>
+                <w:b w:val="0"/>
+                <w:color w:val="141A20"/>
+                <w:sz w:val="17"/>
+              </w:rPr>
+              <w:t>Hasta 30 personas activas y 5 usuarios nominados.</w:t>
+            </w:r>
+          </w:p>
+        </w:tc>
+      </w:tr>
+      <w:tr>
+        <w:trPr>
+          <w:cantSplit/>
+        </w:trPr>
+        <w:tc>
+          <w:tcPr>
+            <w:tcW w:type="dxa" w:w="2232"/>
+            <w:shd w:fill="F0F0FA"/>
+            <w:tcBorders>
+              <w:top w:val="single" w:sz="8" w:color="E3DED2"/>
+              <w:left w:val="single" w:sz="8" w:color="E3DED2"/>
+              <w:bottom w:val="single" w:sz="8" w:color="E3DED2"/>
+              <w:right w:val="single" w:sz="8" w:color="E3DED2"/>
+            </w:tcBorders>
+            <w:vAlign w:val="center"/>
+          </w:tcPr>
+          <w:p>
+            <w:pPr>
+              <w:spacing w:after="60" w:before="60"/>
+            </w:pPr>
+            <w:r/>
+            <w:r>
+              <w:rPr>
+                <w:rFonts w:ascii="Arial" w:hAnsi="Arial"/>
+                <w:b/>
+                <w:color w:val="1A1A5E"/>
+                <w:sz w:val="17"/>
+              </w:rPr>
+              <w:t>Módulos principales</w:t>
+            </w:r>
+          </w:p>
+        </w:tc>
+        <w:tc>
+          <w:tcPr>
+            <w:tcW w:type="dxa" w:w="7992"/>
+            <w:shd w:fill="FFFFFF"/>
             <w:tcBorders>
               <w:top w:val="single" w:sz="8" w:color="E3DED2"/>
               <w:left w:val="single" w:sz="8" w:color="E3DED2"/>
@@ -4075,10 +4136,15 @@
             </w:r>
           </w:p>
         </w:tc>
+      </w:tr>
+      <w:tr>
+        <w:trPr>
+          <w:cantSplit/>
+        </w:trPr>
         <w:tc>
           <w:tcPr>
-            <w:tcW w:type="dxa" w:w="1728"/>
-            <w:shd w:fill="FBF9F5"/>
+            <w:tcW w:type="dxa" w:w="2232"/>
+            <w:shd w:fill="F0F0FA"/>
             <w:tcBorders>
               <w:top w:val="single" w:sz="8" w:color="E3DED2"/>
               <w:left w:val="single" w:sz="8" w:color="E3DED2"/>
@@ -4095,47 +4161,17 @@
             <w:r>
               <w:rPr>
                 <w:rFonts w:ascii="Arial" w:hAnsi="Arial"/>
-                <w:b w:val="0"/>
-                <w:color w:val="141A20"/>
+                <w:b/>
+                <w:color w:val="1A1A5E"/>
                 <w:sz w:val="17"/>
               </w:rPr>
-              <w:t>Hasta 30 personas activas y 5 usuarios nominados.</w:t>
+              <w:t>Valor que habilita</w:t>
             </w:r>
           </w:p>
         </w:tc>
         <w:tc>
           <w:tcPr>
-            <w:tcW w:type="dxa" w:w="1872"/>
-            <w:shd w:fill="FBF9F5"/>
-            <w:tcBorders>
-              <w:top w:val="single" w:sz="8" w:color="E3DED2"/>
-              <w:left w:val="single" w:sz="8" w:color="E3DED2"/>
-              <w:bottom w:val="single" w:sz="8" w:color="E3DED2"/>
-              <w:right w:val="single" w:sz="8" w:color="E3DED2"/>
-            </w:tcBorders>
-            <w:vAlign w:val="center"/>
-          </w:tcPr>
-          <w:p>
-            <w:pPr>
-              <w:spacing w:after="60" w:before="60"/>
-            </w:pPr>
-            <w:r/>
-            <w:r>
-              <w:rPr>
-                <w:rFonts w:ascii="Arial" w:hAnsi="Arial"/>
-                <w:b w:val="0"/>
-                <w:color w:val="141A20"/>
-                <w:sz w:val="17"/>
-              </w:rPr>
-              <w:t>$220.000 / mes</w:t>
-            </w:r>
-          </w:p>
-        </w:tc>
-      </w:tr>
-      <w:tr>
-        <w:tc>
-          <w:tcPr>
-            <w:tcW w:type="dxa" w:w="1944"/>
+            <w:tcW w:type="dxa" w:w="7992"/>
             <w:shd w:fill="FFFFFF"/>
             <w:tcBorders>
               <w:top w:val="single" w:sz="8" w:color="E3DED2"/>
@@ -4157,13 +4193,228 @@
                 <w:color w:val="141A20"/>
                 <w:sz w:val="17"/>
               </w:rPr>
-              <w:t>Nexo Klar Operación</w:t>
+              <w:t>Una fuente única para conocer el estado de clientes, contratos, órdenes, personas y vencimientos.</w:t>
+            </w:r>
+          </w:p>
+        </w:tc>
+      </w:tr>
+    </w:tbl>
+    <w:p>
+      <w:pPr>
+        <w:spacing w:after="100"/>
+      </w:pPr>
+      <w:r>
+        <w:rPr>
+          <w:rFonts w:ascii="Arial" w:hAnsi="Arial"/>
+          <w:b/>
+          <w:color w:val="00706A"/>
+          <w:sz w:val="17"/>
+        </w:rPr>
+        <w:t>Pago anual anticipado: $2.689.200 netos.</w:t>
+      </w:r>
+    </w:p>
+    <w:tbl>
+      <w:tblPr>
+        <w:tblW w:type="auto" w:w="0"/>
+        <w:jc w:val="center"/>
+        <w:tblLayout w:type="fixed"/>
+        <w:tblLook w:firstColumn="1" w:firstRow="1" w:lastColumn="0" w:lastRow="0" w:noHBand="0" w:noVBand="1" w:val="04A0"/>
+      </w:tblPr>
+      <w:tblGrid>
+        <w:gridCol w:w="2232"/>
+        <w:gridCol w:w="7992"/>
+      </w:tblGrid>
+      <w:tr>
+        <w:trPr>
+          <w:cantSplit/>
+        </w:trPr>
+        <w:tc>
+          <w:tcPr>
+            <w:tcW w:type="dxa" w:w="10166"/>
+            <w:gridSpan w:val="2"/>
+            <w:shd w:fill="1A1A5E"/>
+            <w:tcBorders>
+              <w:top w:val="single" w:sz="8" w:color="1A1A5E"/>
+              <w:left w:val="single" w:sz="8" w:color="1A1A5E"/>
+              <w:bottom w:val="single" w:sz="8" w:color="1A1A5E"/>
+              <w:right w:val="single" w:sz="8" w:color="1A1A5E"/>
+            </w:tcBorders>
+            <w:vAlign w:val="center"/>
+          </w:tcPr>
+          <w:p>
+            <w:pPr>
+              <w:spacing w:after="60" w:before="60"/>
+            </w:pPr>
+            <w:r/>
+            <w:r>
+              <w:rPr>
+                <w:rFonts w:ascii="Arial" w:hAnsi="Arial"/>
+                <w:b/>
+                <w:color w:val="FFFFFF"/>
+                <w:sz w:val="24"/>
+              </w:rPr>
+              <w:t>Nexo Klar Operación  |  $490.000 / mes</w:t>
+            </w:r>
+          </w:p>
+        </w:tc>
+      </w:tr>
+      <w:tr>
+        <w:trPr>
+          <w:cantSplit/>
+        </w:trPr>
+        <w:tc>
+          <w:tcPr>
+            <w:tcW w:type="dxa" w:w="2232"/>
+            <w:shd w:fill="F0F0FA"/>
+            <w:tcBorders>
+              <w:top w:val="single" w:sz="8" w:color="E3DED2"/>
+              <w:left w:val="single" w:sz="8" w:color="E3DED2"/>
+              <w:bottom w:val="single" w:sz="8" w:color="E3DED2"/>
+              <w:right w:val="single" w:sz="8" w:color="E3DED2"/>
+            </w:tcBorders>
+            <w:vAlign w:val="center"/>
+          </w:tcPr>
+          <w:p>
+            <w:pPr>
+              <w:spacing w:after="60" w:before="60"/>
+            </w:pPr>
+            <w:r/>
+            <w:r>
+              <w:rPr>
+                <w:rFonts w:ascii="Arial" w:hAnsi="Arial"/>
+                <w:b/>
+                <w:color w:val="1A1A5E"/>
+                <w:sz w:val="17"/>
+              </w:rPr>
+              <w:t>Enfoque</w:t>
             </w:r>
           </w:p>
         </w:tc>
         <w:tc>
           <w:tcPr>
-            <w:tcW w:type="dxa" w:w="4968"/>
+            <w:tcW w:type="dxa" w:w="7992"/>
+            <w:shd w:fill="FFFFFF"/>
+            <w:tcBorders>
+              <w:top w:val="single" w:sz="8" w:color="E3DED2"/>
+              <w:left w:val="single" w:sz="8" w:color="E3DED2"/>
+              <w:bottom w:val="single" w:sz="8" w:color="E3DED2"/>
+              <w:right w:val="single" w:sz="8" w:color="E3DED2"/>
+            </w:tcBorders>
+            <w:vAlign w:val="center"/>
+          </w:tcPr>
+          <w:p>
+            <w:pPr>
+              <w:spacing w:after="60" w:before="60"/>
+            </w:pPr>
+            <w:r/>
+            <w:r>
+              <w:rPr>
+                <w:rFonts w:ascii="Arial" w:hAnsi="Arial"/>
+                <w:b w:val="0"/>
+                <w:color w:val="141A20"/>
+                <w:sz w:val="17"/>
+              </w:rPr>
+              <w:t>Coordinar personas y recursos en una operación de servicios recurrente.</w:t>
+            </w:r>
+          </w:p>
+        </w:tc>
+      </w:tr>
+      <w:tr>
+        <w:trPr>
+          <w:cantSplit/>
+        </w:trPr>
+        <w:tc>
+          <w:tcPr>
+            <w:tcW w:type="dxa" w:w="2232"/>
+            <w:shd w:fill="F0F0FA"/>
+            <w:tcBorders>
+              <w:top w:val="single" w:sz="8" w:color="E3DED2"/>
+              <w:left w:val="single" w:sz="8" w:color="E3DED2"/>
+              <w:bottom w:val="single" w:sz="8" w:color="E3DED2"/>
+              <w:right w:val="single" w:sz="8" w:color="E3DED2"/>
+            </w:tcBorders>
+            <w:vAlign w:val="center"/>
+          </w:tcPr>
+          <w:p>
+            <w:pPr>
+              <w:spacing w:after="60" w:before="60"/>
+            </w:pPr>
+            <w:r/>
+            <w:r>
+              <w:rPr>
+                <w:rFonts w:ascii="Arial" w:hAnsi="Arial"/>
+                <w:b/>
+                <w:color w:val="1A1A5E"/>
+                <w:sz w:val="17"/>
+              </w:rPr>
+              <w:t>Escala incluida</w:t>
+            </w:r>
+          </w:p>
+        </w:tc>
+        <w:tc>
+          <w:tcPr>
+            <w:tcW w:type="dxa" w:w="7992"/>
+            <w:shd w:fill="FFFFFF"/>
+            <w:tcBorders>
+              <w:top w:val="single" w:sz="8" w:color="E3DED2"/>
+              <w:left w:val="single" w:sz="8" w:color="E3DED2"/>
+              <w:bottom w:val="single" w:sz="8" w:color="E3DED2"/>
+              <w:right w:val="single" w:sz="8" w:color="E3DED2"/>
+            </w:tcBorders>
+            <w:vAlign w:val="center"/>
+          </w:tcPr>
+          <w:p>
+            <w:pPr>
+              <w:spacing w:after="60" w:before="60"/>
+            </w:pPr>
+            <w:r/>
+            <w:r>
+              <w:rPr>
+                <w:rFonts w:ascii="Arial" w:hAnsi="Arial"/>
+                <w:b w:val="0"/>
+                <w:color w:val="141A20"/>
+                <w:sz w:val="17"/>
+              </w:rPr>
+              <w:t>Hasta 75 personas activas y 10 usuarios nominados.</w:t>
+            </w:r>
+          </w:p>
+        </w:tc>
+      </w:tr>
+      <w:tr>
+        <w:trPr>
+          <w:cantSplit/>
+        </w:trPr>
+        <w:tc>
+          <w:tcPr>
+            <w:tcW w:type="dxa" w:w="2232"/>
+            <w:shd w:fill="F0F0FA"/>
+            <w:tcBorders>
+              <w:top w:val="single" w:sz="8" w:color="E3DED2"/>
+              <w:left w:val="single" w:sz="8" w:color="E3DED2"/>
+              <w:bottom w:val="single" w:sz="8" w:color="E3DED2"/>
+              <w:right w:val="single" w:sz="8" w:color="E3DED2"/>
+            </w:tcBorders>
+            <w:vAlign w:val="center"/>
+          </w:tcPr>
+          <w:p>
+            <w:pPr>
+              <w:spacing w:after="60" w:before="60"/>
+            </w:pPr>
+            <w:r/>
+            <w:r>
+              <w:rPr>
+                <w:rFonts w:ascii="Arial" w:hAnsi="Arial"/>
+                <w:b/>
+                <w:color w:val="1A1A5E"/>
+                <w:sz w:val="17"/>
+              </w:rPr>
+              <w:t>Módulos principales</w:t>
+            </w:r>
+          </w:p>
+        </w:tc>
+        <w:tc>
+          <w:tcPr>
+            <w:tcW w:type="dxa" w:w="7992"/>
             <w:shd w:fill="FFFFFF"/>
             <w:tcBorders>
               <w:top w:val="single" w:sz="8" w:color="E3DED2"/>
@@ -4189,9 +4440,42 @@
             </w:r>
           </w:p>
         </w:tc>
+      </w:tr>
+      <w:tr>
+        <w:trPr>
+          <w:cantSplit/>
+        </w:trPr>
         <w:tc>
           <w:tcPr>
-            <w:tcW w:type="dxa" w:w="1728"/>
+            <w:tcW w:type="dxa" w:w="2232"/>
+            <w:shd w:fill="F0F0FA"/>
+            <w:tcBorders>
+              <w:top w:val="single" w:sz="8" w:color="E3DED2"/>
+              <w:left w:val="single" w:sz="8" w:color="E3DED2"/>
+              <w:bottom w:val="single" w:sz="8" w:color="E3DED2"/>
+              <w:right w:val="single" w:sz="8" w:color="E3DED2"/>
+            </w:tcBorders>
+            <w:vAlign w:val="center"/>
+          </w:tcPr>
+          <w:p>
+            <w:pPr>
+              <w:spacing w:after="60" w:before="60"/>
+            </w:pPr>
+            <w:r/>
+            <w:r>
+              <w:rPr>
+                <w:rFonts w:ascii="Arial" w:hAnsi="Arial"/>
+                <w:b/>
+                <w:color w:val="1A1A5E"/>
+                <w:sz w:val="17"/>
+              </w:rPr>
+              <w:t>Valor que habilita</w:t>
+            </w:r>
+          </w:p>
+        </w:tc>
+        <w:tc>
+          <w:tcPr>
+            <w:tcW w:type="dxa" w:w="7992"/>
             <w:shd w:fill="FFFFFF"/>
             <w:tcBorders>
               <w:top w:val="single" w:sz="8" w:color="E3DED2"/>
@@ -4213,13 +4497,186 @@
                 <w:color w:val="141A20"/>
                 <w:sz w:val="17"/>
               </w:rPr>
-              <w:t>Hasta 75 personas activas y 10 usuarios nominados.</w:t>
+              <w:t>Preparar servicios con mayor anticipación y reducir brechas de personas, documentos, recursos y coordinación.</w:t>
+            </w:r>
+          </w:p>
+        </w:tc>
+      </w:tr>
+    </w:tbl>
+    <w:p>
+      <w:pPr>
+        <w:spacing w:after="100"/>
+      </w:pPr>
+      <w:r>
+        <w:rPr>
+          <w:rFonts w:ascii="Arial" w:hAnsi="Arial"/>
+          <w:b/>
+          <w:color w:val="00706A"/>
+          <w:sz w:val="17"/>
+        </w:rPr>
+        <w:t>Pago anual anticipado: $5.292.000 netos.</w:t>
+      </w:r>
+    </w:p>
+    <w:tbl>
+      <w:tblPr>
+        <w:tblW w:type="auto" w:w="0"/>
+        <w:jc w:val="center"/>
+        <w:tblLayout w:type="fixed"/>
+        <w:tblLook w:firstColumn="1" w:firstRow="1" w:lastColumn="0" w:lastRow="0" w:noHBand="0" w:noVBand="1" w:val="04A0"/>
+      </w:tblPr>
+      <w:tblGrid>
+        <w:gridCol w:w="1944"/>
+        <w:gridCol w:w="8280"/>
+      </w:tblGrid>
+      <w:tr>
+        <w:tc>
+          <w:tcPr>
+            <w:tcW w:type="dxa" w:w="5083"/>
+            <w:shd w:fill="EAFBF9"/>
+            <w:tcBorders>
+              <w:top w:val="single" w:sz="8" w:color="BDEDE8"/>
+              <w:left w:val="single" w:sz="8" w:color="BDEDE8"/>
+              <w:bottom w:val="single" w:sz="8" w:color="BDEDE8"/>
+              <w:right w:val="single" w:sz="8" w:color="BDEDE8"/>
+            </w:tcBorders>
+            <w:vAlign w:val="center"/>
+          </w:tcPr>
+          <w:p>
+            <w:pPr>
+              <w:spacing w:after="60" w:before="60"/>
+            </w:pPr>
+            <w:r/>
+            <w:r>
+              <w:rPr>
+                <w:rFonts w:ascii="Arial" w:hAnsi="Arial"/>
+                <w:b/>
+                <w:color w:val="00706A"/>
+                <w:sz w:val="18"/>
+              </w:rPr>
+              <w:t>Valor por usuario</w:t>
             </w:r>
           </w:p>
         </w:tc>
         <w:tc>
           <w:tcPr>
-            <w:tcW w:type="dxa" w:w="1872"/>
+            <w:tcW w:type="dxa" w:w="5083"/>
+            <w:shd w:fill="EAFBF9"/>
+            <w:tcBorders>
+              <w:top w:val="single" w:sz="8" w:color="BDEDE8"/>
+              <w:left w:val="single" w:sz="8" w:color="BDEDE8"/>
+              <w:bottom w:val="single" w:sz="8" w:color="BDEDE8"/>
+              <w:right w:val="single" w:sz="8" w:color="BDEDE8"/>
+            </w:tcBorders>
+            <w:vAlign w:val="center"/>
+          </w:tcPr>
+          <w:p>
+            <w:pPr>
+              <w:spacing w:after="60" w:before="60"/>
+            </w:pPr>
+            <w:r/>
+            <w:r>
+              <w:rPr>
+                <w:rFonts w:ascii="Arial" w:hAnsi="Arial"/>
+                <w:b w:val="0"/>
+                <w:color w:val="141A20"/>
+                <w:sz w:val="18"/>
+              </w:rPr>
+              <w:t>A capacidad completa, el costo mensual equivale a $49.800 por usuario Base, $49.000 por usuario Operación y $44.500 por usuario Integral. Este indicador sirve para explicar el valor de una herramienta compartida por equipos administrativos y operativos.</w:t>
+            </w:r>
+          </w:p>
+        </w:tc>
+      </w:tr>
+    </w:tbl>
+    <w:p>
+      <w:pPr>
+        <w:spacing w:after="20"/>
+      </w:pPr>
+    </w:p>
+    <w:p>
+      <w:r>
+        <w:br w:type="page"/>
+      </w:r>
+    </w:p>
+    <w:tbl>
+      <w:tblPr>
+        <w:tblW w:type="auto" w:w="0"/>
+        <w:jc w:val="center"/>
+        <w:tblLayout w:type="fixed"/>
+        <w:tblLook w:firstColumn="1" w:firstRow="1" w:lastColumn="0" w:lastRow="0" w:noHBand="0" w:noVBand="1" w:val="04A0"/>
+      </w:tblPr>
+      <w:tblGrid>
+        <w:gridCol w:w="2232"/>
+        <w:gridCol w:w="7992"/>
+      </w:tblGrid>
+      <w:tr>
+        <w:trPr>
+          <w:cantSplit/>
+        </w:trPr>
+        <w:tc>
+          <w:tcPr>
+            <w:tcW w:type="dxa" w:w="10166"/>
+            <w:gridSpan w:val="2"/>
+            <w:shd w:fill="1A1A5E"/>
+            <w:tcBorders>
+              <w:top w:val="single" w:sz="8" w:color="1A1A5E"/>
+              <w:left w:val="single" w:sz="8" w:color="1A1A5E"/>
+              <w:bottom w:val="single" w:sz="8" w:color="1A1A5E"/>
+              <w:right w:val="single" w:sz="8" w:color="1A1A5E"/>
+            </w:tcBorders>
+            <w:vAlign w:val="center"/>
+          </w:tcPr>
+          <w:p>
+            <w:pPr>
+              <w:spacing w:after="60" w:before="60"/>
+            </w:pPr>
+            <w:r/>
+            <w:r>
+              <w:rPr>
+                <w:rFonts w:ascii="Arial" w:hAnsi="Arial"/>
+                <w:b/>
+                <w:color w:val="FFFFFF"/>
+                <w:sz w:val="24"/>
+              </w:rPr>
+              <w:t>Nexo Klar Integral  |  $890.000 / mes</w:t>
+            </w:r>
+          </w:p>
+        </w:tc>
+      </w:tr>
+      <w:tr>
+        <w:trPr>
+          <w:cantSplit/>
+        </w:trPr>
+        <w:tc>
+          <w:tcPr>
+            <w:tcW w:type="dxa" w:w="2232"/>
+            <w:shd w:fill="F0F0FA"/>
+            <w:tcBorders>
+              <w:top w:val="single" w:sz="8" w:color="E3DED2"/>
+              <w:left w:val="single" w:sz="8" w:color="E3DED2"/>
+              <w:bottom w:val="single" w:sz="8" w:color="E3DED2"/>
+              <w:right w:val="single" w:sz="8" w:color="E3DED2"/>
+            </w:tcBorders>
+            <w:vAlign w:val="center"/>
+          </w:tcPr>
+          <w:p>
+            <w:pPr>
+              <w:spacing w:after="60" w:before="60"/>
+            </w:pPr>
+            <w:r/>
+            <w:r>
+              <w:rPr>
+                <w:rFonts w:ascii="Arial" w:hAnsi="Arial"/>
+                <w:b/>
+                <w:color w:val="1A1A5E"/>
+                <w:sz w:val="17"/>
+              </w:rPr>
+              <w:t>Enfoque</w:t>
+            </w:r>
+          </w:p>
+        </w:tc>
+        <w:tc>
+          <w:tcPr>
+            <w:tcW w:type="dxa" w:w="7992"/>
             <w:shd w:fill="FFFFFF"/>
             <w:tcBorders>
               <w:top w:val="single" w:sz="8" w:color="E3DED2"/>
@@ -4241,16 +4698,47 @@
                 <w:color w:val="141A20"/>
                 <w:sz w:val="17"/>
               </w:rPr>
-              <w:t>$390.000 / mes</w:t>
+              <w:t>Gobierno operacional, cumplimiento avanzado y crecimiento multioperación.</w:t>
             </w:r>
           </w:p>
         </w:tc>
       </w:tr>
       <w:tr>
+        <w:trPr>
+          <w:cantSplit/>
+        </w:trPr>
         <w:tc>
           <w:tcPr>
-            <w:tcW w:type="dxa" w:w="1944"/>
-            <w:shd w:fill="FBF9F5"/>
+            <w:tcW w:type="dxa" w:w="2232"/>
+            <w:shd w:fill="F0F0FA"/>
+            <w:tcBorders>
+              <w:top w:val="single" w:sz="8" w:color="E3DED2"/>
+              <w:left w:val="single" w:sz="8" w:color="E3DED2"/>
+              <w:bottom w:val="single" w:sz="8" w:color="E3DED2"/>
+              <w:right w:val="single" w:sz="8" w:color="E3DED2"/>
+            </w:tcBorders>
+            <w:vAlign w:val="center"/>
+          </w:tcPr>
+          <w:p>
+            <w:pPr>
+              <w:spacing w:after="60" w:before="60"/>
+            </w:pPr>
+            <w:r/>
+            <w:r>
+              <w:rPr>
+                <w:rFonts w:ascii="Arial" w:hAnsi="Arial"/>
+                <w:b/>
+                <w:color w:val="1A1A5E"/>
+                <w:sz w:val="17"/>
+              </w:rPr>
+              <w:t>Escala incluida</w:t>
+            </w:r>
+          </w:p>
+        </w:tc>
+        <w:tc>
+          <w:tcPr>
+            <w:tcW w:type="dxa" w:w="7992"/>
+            <w:shd w:fill="FFFFFF"/>
             <w:tcBorders>
               <w:top w:val="single" w:sz="8" w:color="E3DED2"/>
               <w:left w:val="single" w:sz="8" w:color="E3DED2"/>
@@ -4271,14 +4759,47 @@
                 <w:color w:val="141A20"/>
                 <w:sz w:val="17"/>
               </w:rPr>
-              <w:t>Nexo Klar Integral</w:t>
+              <w:t>Hasta 200 personas activas y 20 usuarios nominados.</w:t>
+            </w:r>
+          </w:p>
+        </w:tc>
+      </w:tr>
+      <w:tr>
+        <w:trPr>
+          <w:cantSplit/>
+        </w:trPr>
+        <w:tc>
+          <w:tcPr>
+            <w:tcW w:type="dxa" w:w="2232"/>
+            <w:shd w:fill="F0F0FA"/>
+            <w:tcBorders>
+              <w:top w:val="single" w:sz="8" w:color="E3DED2"/>
+              <w:left w:val="single" w:sz="8" w:color="E3DED2"/>
+              <w:bottom w:val="single" w:sz="8" w:color="E3DED2"/>
+              <w:right w:val="single" w:sz="8" w:color="E3DED2"/>
+            </w:tcBorders>
+            <w:vAlign w:val="center"/>
+          </w:tcPr>
+          <w:p>
+            <w:pPr>
+              <w:spacing w:after="60" w:before="60"/>
+            </w:pPr>
+            <w:r/>
+            <w:r>
+              <w:rPr>
+                <w:rFonts w:ascii="Arial" w:hAnsi="Arial"/>
+                <w:b/>
+                <w:color w:val="1A1A5E"/>
+                <w:sz w:val="17"/>
+              </w:rPr>
+              <w:t>Módulos principales</w:t>
             </w:r>
           </w:p>
         </w:tc>
         <w:tc>
           <w:tcPr>
-            <w:tcW w:type="dxa" w:w="4968"/>
-            <w:shd w:fill="FBF9F5"/>
+            <w:tcW w:type="dxa" w:w="7992"/>
+            <w:shd w:fill="FFFFFF"/>
             <w:tcBorders>
               <w:top w:val="single" w:sz="8" w:color="E3DED2"/>
               <w:left w:val="single" w:sz="8" w:color="E3DED2"/>
@@ -4303,10 +4824,43 @@
             </w:r>
           </w:p>
         </w:tc>
+      </w:tr>
+      <w:tr>
+        <w:trPr>
+          <w:cantSplit/>
+        </w:trPr>
         <w:tc>
           <w:tcPr>
-            <w:tcW w:type="dxa" w:w="1728"/>
-            <w:shd w:fill="FBF9F5"/>
+            <w:tcW w:type="dxa" w:w="2232"/>
+            <w:shd w:fill="F0F0FA"/>
+            <w:tcBorders>
+              <w:top w:val="single" w:sz="8" w:color="E3DED2"/>
+              <w:left w:val="single" w:sz="8" w:color="E3DED2"/>
+              <w:bottom w:val="single" w:sz="8" w:color="E3DED2"/>
+              <w:right w:val="single" w:sz="8" w:color="E3DED2"/>
+            </w:tcBorders>
+            <w:vAlign w:val="center"/>
+          </w:tcPr>
+          <w:p>
+            <w:pPr>
+              <w:spacing w:after="60" w:before="60"/>
+            </w:pPr>
+            <w:r/>
+            <w:r>
+              <w:rPr>
+                <w:rFonts w:ascii="Arial" w:hAnsi="Arial"/>
+                <w:b/>
+                <w:color w:val="1A1A5E"/>
+                <w:sz w:val="17"/>
+              </w:rPr>
+              <w:t>Valor que habilita</w:t>
+            </w:r>
+          </w:p>
+        </w:tc>
+        <w:tc>
+          <w:tcPr>
+            <w:tcW w:type="dxa" w:w="7992"/>
+            <w:shd w:fill="FFFFFF"/>
             <w:tcBorders>
               <w:top w:val="single" w:sz="8" w:color="E3DED2"/>
               <w:left w:val="single" w:sz="8" w:color="E3DED2"/>
@@ -4327,35 +4881,7 @@
                 <w:color w:val="141A20"/>
                 <w:sz w:val="17"/>
               </w:rPr>
-              <w:t>Hasta 200 personas activas y 20 usuarios nominados.</w:t>
-            </w:r>
-          </w:p>
-        </w:tc>
-        <w:tc>
-          <w:tcPr>
-            <w:tcW w:type="dxa" w:w="1872"/>
-            <w:shd w:fill="FBF9F5"/>
-            <w:tcBorders>
-              <w:top w:val="single" w:sz="8" w:color="E3DED2"/>
-              <w:left w:val="single" w:sz="8" w:color="E3DED2"/>
-              <w:bottom w:val="single" w:sz="8" w:color="E3DED2"/>
-              <w:right w:val="single" w:sz="8" w:color="E3DED2"/>
-            </w:tcBorders>
-            <w:vAlign w:val="center"/>
-          </w:tcPr>
-          <w:p>
-            <w:pPr>
-              <w:spacing w:after="60" w:before="60"/>
-            </w:pPr>
-            <w:r/>
-            <w:r>
-              <w:rPr>
-                <w:rFonts w:ascii="Arial" w:hAnsi="Arial"/>
-                <w:b w:val="0"/>
-                <w:color w:val="141A20"/>
-                <w:sz w:val="17"/>
-              </w:rPr>
-              <w:t>$690.000 / mes</w:t>
+              <w:t>Entregar trazabilidad para gestión, auditoría, costos, expansión y decisiones ejecutivas.</w:t>
             </w:r>
           </w:p>
         </w:tc>
@@ -4363,8 +4889,17 @@
     </w:tbl>
     <w:p>
       <w:pPr>
-        <w:spacing w:after="40"/>
+        <w:spacing w:after="100"/>
       </w:pPr>
+      <w:r>
+        <w:rPr>
+          <w:rFonts w:ascii="Arial" w:hAnsi="Arial"/>
+          <w:b/>
+          <w:color w:val="00706A"/>
+          <w:sz w:val="17"/>
+        </w:rPr>
+        <w:t>Pago anual anticipado: $9.612.000 netos.</w:t>
+      </w:r>
     </w:p>
     <w:tbl>
       <w:tblPr>
@@ -4575,7 +5110,7 @@
                 <w:color w:val="141A20"/>
                 <w:sz w:val="17"/>
               </w:rPr>
-              <w:t>Libro de obra digital</w:t>
+              <w:t>Usuario adicional</w:t>
             </w:r>
           </w:p>
         </w:tc>
@@ -4603,6 +5138,92 @@
                 <w:color w:val="141A20"/>
                 <w:sz w:val="17"/>
               </w:rPr>
+              <w:t>Base: $18.000 · Operación: $25.000 · Integral: $35.000 / mes</w:t>
+            </w:r>
+          </w:p>
+        </w:tc>
+        <w:tc>
+          <w:tcPr>
+            <w:tcW w:type="dxa" w:w="5184"/>
+            <w:shd w:fill="FFFFFF"/>
+            <w:tcBorders>
+              <w:top w:val="single" w:sz="8" w:color="E3DED2"/>
+              <w:left w:val="single" w:sz="8" w:color="E3DED2"/>
+              <w:bottom w:val="single" w:sz="8" w:color="E3DED2"/>
+              <w:right w:val="single" w:sz="8" w:color="E3DED2"/>
+            </w:tcBorders>
+            <w:vAlign w:val="center"/>
+          </w:tcPr>
+          <w:p>
+            <w:pPr>
+              <w:spacing w:after="60" w:before="60"/>
+            </w:pPr>
+            <w:r/>
+            <w:r>
+              <w:rPr>
+                <w:rFonts w:ascii="Arial" w:hAnsi="Arial"/>
+                <w:b w:val="0"/>
+                <w:color w:val="141A20"/>
+                <w:sz w:val="17"/>
+              </w:rPr>
+              <w:t>Solo para usuarios con acceso nominativo que excedan el plan.</w:t>
+            </w:r>
+          </w:p>
+        </w:tc>
+      </w:tr>
+      <w:tr>
+        <w:tc>
+          <w:tcPr>
+            <w:tcW w:type="dxa" w:w="3096"/>
+            <w:shd w:fill="FBF9F5"/>
+            <w:tcBorders>
+              <w:top w:val="single" w:sz="8" w:color="E3DED2"/>
+              <w:left w:val="single" w:sz="8" w:color="E3DED2"/>
+              <w:bottom w:val="single" w:sz="8" w:color="E3DED2"/>
+              <w:right w:val="single" w:sz="8" w:color="E3DED2"/>
+            </w:tcBorders>
+            <w:vAlign w:val="center"/>
+          </w:tcPr>
+          <w:p>
+            <w:pPr>
+              <w:spacing w:after="60" w:before="60"/>
+            </w:pPr>
+            <w:r/>
+            <w:r>
+              <w:rPr>
+                <w:rFonts w:ascii="Arial" w:hAnsi="Arial"/>
+                <w:b w:val="0"/>
+                <w:color w:val="141A20"/>
+                <w:sz w:val="17"/>
+              </w:rPr>
+              <w:t>Libro de obra digital</w:t>
+            </w:r>
+          </w:p>
+        </w:tc>
+        <w:tc>
+          <w:tcPr>
+            <w:tcW w:type="dxa" w:w="2232"/>
+            <w:shd w:fill="FBF9F5"/>
+            <w:tcBorders>
+              <w:top w:val="single" w:sz="8" w:color="E3DED2"/>
+              <w:left w:val="single" w:sz="8" w:color="E3DED2"/>
+              <w:bottom w:val="single" w:sz="8" w:color="E3DED2"/>
+              <w:right w:val="single" w:sz="8" w:color="E3DED2"/>
+            </w:tcBorders>
+            <w:vAlign w:val="center"/>
+          </w:tcPr>
+          <w:p>
+            <w:pPr>
+              <w:spacing w:after="60" w:before="60"/>
+            </w:pPr>
+            <w:r/>
+            <w:r>
+              <w:rPr>
+                <w:rFonts w:ascii="Arial" w:hAnsi="Arial"/>
+                <w:b w:val="0"/>
+                <w:color w:val="141A20"/>
+                <w:sz w:val="17"/>
+              </w:rPr>
               <w:t>Desde $95.000 / mes</w:t>
             </w:r>
           </w:p>
@@ -4610,7 +5231,7 @@
         <w:tc>
           <w:tcPr>
             <w:tcW w:type="dxa" w:w="5184"/>
-            <w:shd w:fill="FFFFFF"/>
+            <w:shd w:fill="FBF9F5"/>
             <w:tcBorders>
               <w:top w:val="single" w:sz="8" w:color="E3DED2"/>
               <w:left w:val="single" w:sz="8" w:color="E3DED2"/>
@@ -4640,7 +5261,7 @@
         <w:tc>
           <w:tcPr>
             <w:tcW w:type="dxa" w:w="3096"/>
-            <w:shd w:fill="FBF9F5"/>
+            <w:shd w:fill="FFFFFF"/>
             <w:tcBorders>
               <w:top w:val="single" w:sz="8" w:color="E3DED2"/>
               <w:left w:val="single" w:sz="8" w:color="E3DED2"/>
@@ -4668,7 +5289,7 @@
         <w:tc>
           <w:tcPr>
             <w:tcW w:type="dxa" w:w="2232"/>
-            <w:shd w:fill="FBF9F5"/>
+            <w:shd w:fill="FFFFFF"/>
             <w:tcBorders>
               <w:top w:val="single" w:sz="8" w:color="E3DED2"/>
               <w:left w:val="single" w:sz="8" w:color="E3DED2"/>
@@ -4696,7 +5317,7 @@
         <w:tc>
           <w:tcPr>
             <w:tcW w:type="dxa" w:w="5184"/>
-            <w:shd w:fill="FBF9F5"/>
+            <w:shd w:fill="FFFFFF"/>
             <w:tcBorders>
               <w:top w:val="single" w:sz="8" w:color="E3DED2"/>
               <w:left w:val="single" w:sz="8" w:color="E3DED2"/>
@@ -4726,7 +5347,7 @@
         <w:tc>
           <w:tcPr>
             <w:tcW w:type="dxa" w:w="3096"/>
-            <w:shd w:fill="FFFFFF"/>
+            <w:shd w:fill="FBF9F5"/>
             <w:tcBorders>
               <w:top w:val="single" w:sz="8" w:color="E3DED2"/>
               <w:left w:val="single" w:sz="8" w:color="E3DED2"/>
@@ -4754,7 +5375,7 @@
         <w:tc>
           <w:tcPr>
             <w:tcW w:type="dxa" w:w="2232"/>
-            <w:shd w:fill="FFFFFF"/>
+            <w:shd w:fill="FBF9F5"/>
             <w:tcBorders>
               <w:top w:val="single" w:sz="8" w:color="E3DED2"/>
               <w:left w:val="single" w:sz="8" w:color="E3DED2"/>
@@ -4782,7 +5403,7 @@
         <w:tc>
           <w:tcPr>
             <w:tcW w:type="dxa" w:w="5184"/>
-            <w:shd w:fill="FFFFFF"/>
+            <w:shd w:fill="FBF9F5"/>
             <w:tcBorders>
               <w:top w:val="single" w:sz="8" w:color="E3DED2"/>
               <w:left w:val="single" w:sz="8" w:color="E3DED2"/>
@@ -4812,7 +5433,7 @@
         <w:tc>
           <w:tcPr>
             <w:tcW w:type="dxa" w:w="3096"/>
-            <w:shd w:fill="FBF9F5"/>
+            <w:shd w:fill="FFFFFF"/>
             <w:tcBorders>
               <w:top w:val="single" w:sz="8" w:color="E3DED2"/>
               <w:left w:val="single" w:sz="8" w:color="E3DED2"/>
@@ -4840,7 +5461,7 @@
         <w:tc>
           <w:tcPr>
             <w:tcW w:type="dxa" w:w="2232"/>
-            <w:shd w:fill="FBF9F5"/>
+            <w:shd w:fill="FFFFFF"/>
             <w:tcBorders>
               <w:top w:val="single" w:sz="8" w:color="E3DED2"/>
               <w:left w:val="single" w:sz="8" w:color="E3DED2"/>
@@ -4868,7 +5489,7 @@
         <w:tc>
           <w:tcPr>
             <w:tcW w:type="dxa" w:w="5184"/>
-            <w:shd w:fill="FBF9F5"/>
+            <w:shd w:fill="FFFFFF"/>
             <w:tcBorders>
               <w:top w:val="single" w:sz="8" w:color="E3DED2"/>
               <w:left w:val="single" w:sz="8" w:color="E3DED2"/>
@@ -4910,7 +5531,7 @@
           <w:color w:val="141A20"/>
           <w:sz w:val="20"/>
         </w:rPr>
-        <w:t>Condición sugerida: contrato mínimo de 12 meses. Pago anual anticipado: 10% de descuento en la suscripción o bonificación parcial del onboarding, no ambos. Para clientes piloto, aplicar un descuento temporal y dejarlo expresamente limitado a los primeros 90 días.</w:t>
+        <w:t>Condición sugerida: contrato mínimo de 12 meses. Pago anual anticipado: 10% de descuento en la suscripción o bonificación parcial del onboarding, no ambos. Para clientes piloto, aplicar un descuento temporal y dejarlo expresamente limitado a los primeros 90 días. Banda de negociación recomendada: máximo 15% de descuento sobre tarifa lista, siempre a cambio de plazo anual, caso de éxito autorizado o volumen comprometido.</w:t>
       </w:r>
     </w:p>
     <w:p>
@@ -5153,7 +5774,7 @@
                 <w:color w:val="141A20"/>
                 <w:sz w:val="17"/>
               </w:rPr>
-              <w:t>Sin costo en contrato anual; $120.000 en mensual.</w:t>
+              <w:t>Sin costo en contrato anual; $150.000 en mensual.</w:t>
             </w:r>
           </w:p>
         </w:tc>
@@ -5267,7 +5888,7 @@
                 <w:color w:val="141A20"/>
                 <w:sz w:val="17"/>
               </w:rPr>
-              <w:t>$390.000 único</w:t>
+              <w:t>$490.000 único</w:t>
             </w:r>
           </w:p>
         </w:tc>
@@ -5381,7 +6002,7 @@
                 <w:color w:val="141A20"/>
                 <w:sz w:val="17"/>
               </w:rPr>
-              <w:t>$790.000 único</w:t>
+              <w:t>$990.000 único</w:t>
             </w:r>
           </w:p>
         </w:tc>
@@ -5495,7 +6116,7 @@
                 <w:color w:val="141A20"/>
                 <w:sz w:val="17"/>
               </w:rPr>
-              <w:t>Desde $1.500.000 + alcance</w:t>
+              <w:t>Desde $2.500.000 + alcance</w:t>
             </w:r>
           </w:p>
         </w:tc>
@@ -5561,7 +6182,7 @@
           <w:color w:val="141A20"/>
           <w:sz w:val="19"/>
         </w:rPr>
-        <w:t>Piloto recomendado: 60 días pagados a $250.000, acreditables al 100% a la implementación si se contrata un plan anual. No ofrecer pilotos ilimitados ni cargas masivas gratis.</w:t>
+        <w:t>Piloto recomendado: 60 días pagados a $350.000, acreditables al 100% a la implementación si se contrata un plan anual. No ofrecer pilotos ilimitados ni cargas masivas gratis.</w:t>
       </w:r>
     </w:p>
     <w:p>

</xml_diff>

<commit_message>
docs: prevent commercial plan layout clipping
</commit_message>
<xml_diff>
--- a/docs/Plan_Comercial_Nexo_Klar_2026_2027.docx
+++ b/docs/Plan_Comercial_Nexo_Klar_2026_2027.docx
@@ -181,7 +181,7 @@
     </w:p>
     <w:p>
       <w:pPr>
-        <w:spacing w:after="120"/>
+        <w:spacing w:before="240" w:after="120"/>
       </w:pPr>
       <w:r>
         <w:rPr>
@@ -660,8 +660,13 @@
       </w:pPr>
     </w:p>
     <w:p>
+      <w:r>
+        <w:br w:type="page"/>
+      </w:r>
+    </w:p>
+    <w:p>
       <w:pPr>
-        <w:spacing w:after="120"/>
+        <w:spacing w:before="240" w:after="120"/>
       </w:pPr>
       <w:r>
         <w:rPr>
@@ -1244,7 +1249,7 @@
           <w:color w:val="141A20"/>
           <w:sz w:val="20"/>
         </w:rPr>
-        <w:t>&lt;b&gt;Lectura de usabilidad.&lt;/b&gt;</w:t>
+        <w:t>Lectura de usabilidad.</w:t>
       </w:r>
       <w:r>
         <w:rPr>
@@ -1262,7 +1267,7 @@
     </w:p>
     <w:p>
       <w:pPr>
-        <w:spacing w:after="120"/>
+        <w:spacing w:before="240" w:after="120"/>
       </w:pPr>
       <w:r>
         <w:rPr>
@@ -2075,7 +2080,7 @@
     </w:p>
     <w:p>
       <w:pPr>
-        <w:spacing w:after="120"/>
+        <w:spacing w:before="240" w:after="120"/>
       </w:pPr>
       <w:r>
         <w:rPr>
@@ -2740,7 +2745,7 @@
     </w:p>
     <w:p>
       <w:pPr>
-        <w:spacing w:after="120"/>
+        <w:spacing w:before="240" w:after="120"/>
       </w:pPr>
       <w:r>
         <w:rPr>
@@ -3303,7 +3308,7 @@
     </w:p>
     <w:p>
       <w:pPr>
-        <w:spacing w:after="120"/>
+        <w:spacing w:before="240" w:after="120"/>
       </w:pPr>
       <w:r>
         <w:rPr>
@@ -3871,7 +3876,7 @@
     </w:p>
     <w:p>
       <w:pPr>
-        <w:spacing w:after="120"/>
+        <w:spacing w:before="240" w:after="120"/>
       </w:pPr>
       <w:r>
         <w:rPr>
@@ -5541,7 +5546,7 @@
     </w:p>
     <w:p>
       <w:pPr>
-        <w:spacing w:after="120"/>
+        <w:spacing w:before="240" w:after="120"/>
       </w:pPr>
       <w:r>
         <w:rPr>
@@ -6282,7 +6287,7 @@
     </w:p>
     <w:p>
       <w:pPr>
-        <w:spacing w:after="120"/>
+        <w:spacing w:before="240" w:after="120"/>
       </w:pPr>
       <w:r>
         <w:rPr>
@@ -7003,8 +7008,13 @@
       </w:pPr>
     </w:p>
     <w:p>
+      <w:r>
+        <w:br w:type="page"/>
+      </w:r>
+    </w:p>
+    <w:p>
       <w:pPr>
-        <w:spacing w:after="120"/>
+        <w:spacing w:before="240" w:after="120"/>
       </w:pPr>
       <w:r>
         <w:rPr>
@@ -7443,7 +7453,7 @@
     </w:p>
     <w:p>
       <w:pPr>
-        <w:spacing w:after="120"/>
+        <w:spacing w:before="240" w:after="120"/>
       </w:pPr>
       <w:r>
         <w:rPr>
@@ -8336,8 +8346,13 @@
       </w:r>
     </w:p>
     <w:p>
+      <w:r>
+        <w:br w:type="page"/>
+      </w:r>
+    </w:p>
+    <w:p>
       <w:pPr>
-        <w:spacing w:after="120"/>
+        <w:spacing w:before="240" w:after="120"/>
       </w:pPr>
       <w:r>
         <w:rPr>
@@ -8861,8 +8876,13 @@
       </w:pPr>
     </w:p>
     <w:p>
+      <w:r>
+        <w:br w:type="page"/>
+      </w:r>
+    </w:p>
+    <w:p>
       <w:pPr>
-        <w:spacing w:after="120"/>
+        <w:spacing w:before="240" w:after="120"/>
       </w:pPr>
       <w:r>
         <w:rPr>

</xml_diff>

<commit_message>
docs: center commercial plan visuals
</commit_message>
<xml_diff>
--- a/docs/Plan_Comercial_Nexo_Klar_2026_2027.docx
+++ b/docs/Plan_Comercial_Nexo_Klar_2026_2027.docx
@@ -61,7 +61,7 @@
       <w:tr>
         <w:tc>
           <w:tcPr>
-            <w:tcW w:type="dxa" w:w="5083"/>
+            <w:tcW w:type="dxa" w:w="4968"/>
             <w:shd w:fill="EAFBF9"/>
             <w:tcBorders>
               <w:top w:val="single" w:sz="8" w:color="BDEDE8"/>
@@ -89,7 +89,7 @@
         </w:tc>
         <w:tc>
           <w:tcPr>
-            <w:tcW w:type="dxa" w:w="5083"/>
+            <w:tcW w:type="dxa" w:w="4968"/>
             <w:shd w:fill="EAFBF9"/>
             <w:tcBorders>
               <w:top w:val="single" w:sz="8" w:color="BDEDE8"/>
@@ -129,7 +129,7 @@
       <w:r>
         <w:drawing>
           <wp:inline xmlns:a="http://schemas.openxmlformats.org/drawingml/2006/main" xmlns:pic="http://schemas.openxmlformats.org/drawingml/2006/picture">
-            <wp:extent cx="6217920" cy="2526030"/>
+            <wp:extent cx="5715000" cy="2321719"/>
             <wp:docPr id="1" name="Picture 1"/>
             <wp:cNvGraphicFramePr>
               <a:graphicFrameLocks noChangeAspect="1"/>
@@ -150,7 +150,7 @@
                   <pic:spPr>
                     <a:xfrm>
                       <a:off x="0" y="0"/>
-                      <a:ext cx="6217920" cy="2526030"/>
+                      <a:ext cx="5715000" cy="2321719"/>
                     </a:xfrm>
                     <a:prstGeom prst="rect"/>
                   </pic:spPr>
@@ -233,7 +233,7 @@
       <w:tr>
         <w:tc>
           <w:tcPr>
-            <w:tcW w:type="dxa" w:w="5083"/>
+            <w:tcW w:type="dxa" w:w="4968"/>
             <w:shd w:fill="1A1A5E"/>
             <w:tcBorders>
               <w:top w:val="single" w:sz="8" w:color="1A1A5E"/>
@@ -261,7 +261,7 @@
         </w:tc>
         <w:tc>
           <w:tcPr>
-            <w:tcW w:type="dxa" w:w="5083"/>
+            <w:tcW w:type="dxa" w:w="4968"/>
             <w:shd w:fill="1A1A5E"/>
             <w:tcBorders>
               <w:top w:val="single" w:sz="8" w:color="1A1A5E"/>
@@ -598,7 +598,7 @@
       <w:tr>
         <w:tc>
           <w:tcPr>
-            <w:tcW w:type="dxa" w:w="5083"/>
+            <w:tcW w:type="dxa" w:w="4968"/>
             <w:shd w:fill="EAFBF9"/>
             <w:tcBorders>
               <w:top w:val="single" w:sz="8" w:color="BDEDE8"/>
@@ -626,7 +626,7 @@
         </w:tc>
         <w:tc>
           <w:tcPr>
-            <w:tcW w:type="dxa" w:w="5083"/>
+            <w:tcW w:type="dxa" w:w="4968"/>
             <w:shd w:fill="EAFBF9"/>
             <w:tcBorders>
               <w:top w:val="single" w:sz="8" w:color="BDEDE8"/>
@@ -719,7 +719,7 @@
       <w:tr>
         <w:tc>
           <w:tcPr>
-            <w:tcW w:type="dxa" w:w="3389"/>
+            <w:tcW w:type="dxa" w:w="3312"/>
             <w:shd w:fill="1A1A5E"/>
             <w:tcBorders>
               <w:top w:val="single" w:sz="8" w:color="1A1A5E"/>
@@ -747,7 +747,7 @@
         </w:tc>
         <w:tc>
           <w:tcPr>
-            <w:tcW w:type="dxa" w:w="3389"/>
+            <w:tcW w:type="dxa" w:w="3312"/>
             <w:shd w:fill="1A1A5E"/>
             <w:tcBorders>
               <w:top w:val="single" w:sz="8" w:color="1A1A5E"/>
@@ -775,7 +775,7 @@
         </w:tc>
         <w:tc>
           <w:tcPr>
-            <w:tcW w:type="dxa" w:w="3389"/>
+            <w:tcW w:type="dxa" w:w="3312"/>
             <w:shd w:fill="1A1A5E"/>
             <w:tcBorders>
               <w:top w:val="single" w:sz="8" w:color="1A1A5E"/>
@@ -1307,7 +1307,7 @@
       <w:tr>
         <w:tc>
           <w:tcPr>
-            <w:tcW w:type="dxa" w:w="3389"/>
+            <w:tcW w:type="dxa" w:w="3312"/>
             <w:shd w:fill="1A1A5E"/>
             <w:tcBorders>
               <w:top w:val="single" w:sz="8" w:color="1A1A5E"/>
@@ -1335,7 +1335,7 @@
         </w:tc>
         <w:tc>
           <w:tcPr>
-            <w:tcW w:type="dxa" w:w="3389"/>
+            <w:tcW w:type="dxa" w:w="3312"/>
             <w:shd w:fill="1A1A5E"/>
             <w:tcBorders>
               <w:top w:val="single" w:sz="8" w:color="1A1A5E"/>
@@ -1363,7 +1363,7 @@
         </w:tc>
         <w:tc>
           <w:tcPr>
-            <w:tcW w:type="dxa" w:w="3389"/>
+            <w:tcW w:type="dxa" w:w="3312"/>
             <w:shd w:fill="1A1A5E"/>
             <w:tcBorders>
               <w:top w:val="single" w:sz="8" w:color="1A1A5E"/>
@@ -2012,7 +2012,7 @@
       <w:tr>
         <w:tc>
           <w:tcPr>
-            <w:tcW w:type="dxa" w:w="5083"/>
+            <w:tcW w:type="dxa" w:w="4968"/>
             <w:shd w:fill="EAFBF9"/>
             <w:tcBorders>
               <w:top w:val="single" w:sz="8" w:color="BDEDE8"/>
@@ -2040,7 +2040,7 @@
         </w:tc>
         <w:tc>
           <w:tcPr>
-            <w:tcW w:type="dxa" w:w="5083"/>
+            <w:tcW w:type="dxa" w:w="4968"/>
             <w:shd w:fill="EAFBF9"/>
             <w:tcBorders>
               <w:top w:val="single" w:sz="8" w:color="BDEDE8"/>
@@ -2133,7 +2133,7 @@
       <w:tr>
         <w:tc>
           <w:tcPr>
-            <w:tcW w:type="dxa" w:w="3389"/>
+            <w:tcW w:type="dxa" w:w="3312"/>
             <w:shd w:fill="1A1A5E"/>
             <w:tcBorders>
               <w:top w:val="single" w:sz="8" w:color="1A1A5E"/>
@@ -2161,7 +2161,7 @@
         </w:tc>
         <w:tc>
           <w:tcPr>
-            <w:tcW w:type="dxa" w:w="3389"/>
+            <w:tcW w:type="dxa" w:w="3312"/>
             <w:shd w:fill="1A1A5E"/>
             <w:tcBorders>
               <w:top w:val="single" w:sz="8" w:color="1A1A5E"/>
@@ -2189,7 +2189,7 @@
         </w:tc>
         <w:tc>
           <w:tcPr>
-            <w:tcW w:type="dxa" w:w="3389"/>
+            <w:tcW w:type="dxa" w:w="3312"/>
             <w:shd w:fill="1A1A5E"/>
             <w:tcBorders>
               <w:top w:val="single" w:sz="8" w:color="1A1A5E"/>
@@ -2785,7 +2785,7 @@
       <w:tr>
         <w:tc>
           <w:tcPr>
-            <w:tcW w:type="dxa" w:w="3389"/>
+            <w:tcW w:type="dxa" w:w="3312"/>
             <w:shd w:fill="1A1A5E"/>
             <w:tcBorders>
               <w:top w:val="single" w:sz="8" w:color="1A1A5E"/>
@@ -2813,7 +2813,7 @@
         </w:tc>
         <w:tc>
           <w:tcPr>
-            <w:tcW w:type="dxa" w:w="3389"/>
+            <w:tcW w:type="dxa" w:w="3312"/>
             <w:shd w:fill="1A1A5E"/>
             <w:tcBorders>
               <w:top w:val="single" w:sz="8" w:color="1A1A5E"/>
@@ -2841,7 +2841,7 @@
         </w:tc>
         <w:tc>
           <w:tcPr>
-            <w:tcW w:type="dxa" w:w="3389"/>
+            <w:tcW w:type="dxa" w:w="3312"/>
             <w:shd w:fill="1A1A5E"/>
             <w:tcBorders>
               <w:top w:val="single" w:sz="8" w:color="1A1A5E"/>
@@ -3245,7 +3245,7 @@
       <w:tr>
         <w:tc>
           <w:tcPr>
-            <w:tcW w:type="dxa" w:w="5083"/>
+            <w:tcW w:type="dxa" w:w="4968"/>
             <w:shd w:fill="EAFBF9"/>
             <w:tcBorders>
               <w:top w:val="single" w:sz="8" w:color="BDEDE8"/>
@@ -3273,7 +3273,7 @@
         </w:tc>
         <w:tc>
           <w:tcPr>
-            <w:tcW w:type="dxa" w:w="5083"/>
+            <w:tcW w:type="dxa" w:w="4968"/>
             <w:shd w:fill="EAFBF9"/>
             <w:tcBorders>
               <w:top w:val="single" w:sz="8" w:color="BDEDE8"/>
@@ -3361,7 +3361,7 @@
       <w:tr>
         <w:tc>
           <w:tcPr>
-            <w:tcW w:type="dxa" w:w="3389"/>
+            <w:tcW w:type="dxa" w:w="3312"/>
             <w:shd w:fill="1A1A5E"/>
             <w:tcBorders>
               <w:top w:val="single" w:sz="8" w:color="1A1A5E"/>
@@ -3389,7 +3389,7 @@
         </w:tc>
         <w:tc>
           <w:tcPr>
-            <w:tcW w:type="dxa" w:w="3389"/>
+            <w:tcW w:type="dxa" w:w="3312"/>
             <w:shd w:fill="1A1A5E"/>
             <w:tcBorders>
               <w:top w:val="single" w:sz="8" w:color="1A1A5E"/>
@@ -3417,7 +3417,7 @@
         </w:tc>
         <w:tc>
           <w:tcPr>
-            <w:tcW w:type="dxa" w:w="3389"/>
+            <w:tcW w:type="dxa" w:w="3312"/>
             <w:shd w:fill="1A1A5E"/>
             <w:tcBorders>
               <w:top w:val="single" w:sz="8" w:color="1A1A5E"/>
@@ -3808,7 +3808,7 @@
       <w:tr>
         <w:tc>
           <w:tcPr>
-            <w:tcW w:type="dxa" w:w="5083"/>
+            <w:tcW w:type="dxa" w:w="4968"/>
             <w:shd w:fill="EAFBF9"/>
             <w:tcBorders>
               <w:top w:val="single" w:sz="8" w:color="BDEDE8"/>
@@ -3836,7 +3836,7 @@
         </w:tc>
         <w:tc>
           <w:tcPr>
-            <w:tcW w:type="dxa" w:w="5083"/>
+            <w:tcW w:type="dxa" w:w="4968"/>
             <w:shd w:fill="EAFBF9"/>
             <w:tcBorders>
               <w:top w:val="single" w:sz="8" w:color="BDEDE8"/>
@@ -3931,7 +3931,7 @@
         </w:trPr>
         <w:tc>
           <w:tcPr>
-            <w:tcW w:type="dxa" w:w="10166"/>
+            <w:tcW w:type="dxa" w:w="9936"/>
             <w:gridSpan w:val="2"/>
             <w:shd w:fill="1A1A5E"/>
             <w:tcBorders>
@@ -4235,7 +4235,7 @@
         </w:trPr>
         <w:tc>
           <w:tcPr>
-            <w:tcW w:type="dxa" w:w="10166"/>
+            <w:tcW w:type="dxa" w:w="9936"/>
             <w:gridSpan w:val="2"/>
             <w:shd w:fill="1A1A5E"/>
             <w:tcBorders>
@@ -4536,7 +4536,7 @@
       <w:tr>
         <w:tc>
           <w:tcPr>
-            <w:tcW w:type="dxa" w:w="5083"/>
+            <w:tcW w:type="dxa" w:w="4968"/>
             <w:shd w:fill="EAFBF9"/>
             <w:tcBorders>
               <w:top w:val="single" w:sz="8" w:color="BDEDE8"/>
@@ -4564,7 +4564,7 @@
         </w:tc>
         <w:tc>
           <w:tcPr>
-            <w:tcW w:type="dxa" w:w="5083"/>
+            <w:tcW w:type="dxa" w:w="4968"/>
             <w:shd w:fill="EAFBF9"/>
             <w:tcBorders>
               <w:top w:val="single" w:sz="8" w:color="BDEDE8"/>
@@ -4619,7 +4619,7 @@
         </w:trPr>
         <w:tc>
           <w:tcPr>
-            <w:tcW w:type="dxa" w:w="10166"/>
+            <w:tcW w:type="dxa" w:w="9936"/>
             <w:gridSpan w:val="2"/>
             <w:shd w:fill="1A1A5E"/>
             <w:tcBorders>
@@ -4921,7 +4921,7 @@
       <w:tr>
         <w:tc>
           <w:tcPr>
-            <w:tcW w:type="dxa" w:w="3389"/>
+            <w:tcW w:type="dxa" w:w="3312"/>
             <w:shd w:fill="1A1A5E"/>
             <w:tcBorders>
               <w:top w:val="single" w:sz="8" w:color="1A1A5E"/>
@@ -4949,7 +4949,7 @@
         </w:tc>
         <w:tc>
           <w:tcPr>
-            <w:tcW w:type="dxa" w:w="3389"/>
+            <w:tcW w:type="dxa" w:w="3312"/>
             <w:shd w:fill="1A1A5E"/>
             <w:tcBorders>
               <w:top w:val="single" w:sz="8" w:color="1A1A5E"/>
@@ -4977,7 +4977,7 @@
         </w:tc>
         <w:tc>
           <w:tcPr>
-            <w:tcW w:type="dxa" w:w="3389"/>
+            <w:tcW w:type="dxa" w:w="3312"/>
             <w:shd w:fill="1A1A5E"/>
             <w:tcBorders>
               <w:top w:val="single" w:sz="8" w:color="1A1A5E"/>
@@ -5587,7 +5587,7 @@
       <w:tr>
         <w:tc>
           <w:tcPr>
-            <w:tcW w:type="dxa" w:w="2541"/>
+            <w:tcW w:type="dxa" w:w="2484"/>
             <w:shd w:fill="1A1A5E"/>
             <w:tcBorders>
               <w:top w:val="single" w:sz="8" w:color="1A1A5E"/>
@@ -5615,7 +5615,7 @@
         </w:tc>
         <w:tc>
           <w:tcPr>
-            <w:tcW w:type="dxa" w:w="2541"/>
+            <w:tcW w:type="dxa" w:w="2484"/>
             <w:shd w:fill="1A1A5E"/>
             <w:tcBorders>
               <w:top w:val="single" w:sz="8" w:color="1A1A5E"/>
@@ -5643,7 +5643,7 @@
         </w:tc>
         <w:tc>
           <w:tcPr>
-            <w:tcW w:type="dxa" w:w="2541"/>
+            <w:tcW w:type="dxa" w:w="2484"/>
             <w:shd w:fill="1A1A5E"/>
             <w:tcBorders>
               <w:top w:val="single" w:sz="8" w:color="1A1A5E"/>
@@ -5671,7 +5671,7 @@
         </w:tc>
         <w:tc>
           <w:tcPr>
-            <w:tcW w:type="dxa" w:w="2541"/>
+            <w:tcW w:type="dxa" w:w="2484"/>
             <w:shd w:fill="1A1A5E"/>
             <w:tcBorders>
               <w:top w:val="single" w:sz="8" w:color="1A1A5E"/>
@@ -6219,7 +6219,7 @@
       <w:tr>
         <w:tc>
           <w:tcPr>
-            <w:tcW w:type="dxa" w:w="5083"/>
+            <w:tcW w:type="dxa" w:w="4968"/>
             <w:shd w:fill="EAFBF9"/>
             <w:tcBorders>
               <w:top w:val="single" w:sz="8" w:color="BDEDE8"/>
@@ -6247,7 +6247,7 @@
         </w:tc>
         <w:tc>
           <w:tcPr>
-            <w:tcW w:type="dxa" w:w="5083"/>
+            <w:tcW w:type="dxa" w:w="4968"/>
             <w:shd w:fill="EAFBF9"/>
             <w:tcBorders>
               <w:top w:val="single" w:sz="8" w:color="BDEDE8"/>
@@ -6327,7 +6327,7 @@
       <w:tr>
         <w:tc>
           <w:tcPr>
-            <w:tcW w:type="dxa" w:w="3389"/>
+            <w:tcW w:type="dxa" w:w="3312"/>
             <w:shd w:fill="1A1A5E"/>
             <w:tcBorders>
               <w:top w:val="single" w:sz="8" w:color="1A1A5E"/>
@@ -6355,7 +6355,7 @@
         </w:tc>
         <w:tc>
           <w:tcPr>
-            <w:tcW w:type="dxa" w:w="3389"/>
+            <w:tcW w:type="dxa" w:w="3312"/>
             <w:shd w:fill="1A1A5E"/>
             <w:tcBorders>
               <w:top w:val="single" w:sz="8" w:color="1A1A5E"/>
@@ -6383,7 +6383,7 @@
         </w:tc>
         <w:tc>
           <w:tcPr>
-            <w:tcW w:type="dxa" w:w="3389"/>
+            <w:tcW w:type="dxa" w:w="3312"/>
             <w:shd w:fill="1A1A5E"/>
             <w:tcBorders>
               <w:top w:val="single" w:sz="8" w:color="1A1A5E"/>
@@ -6946,7 +6946,7 @@
       <w:tr>
         <w:tc>
           <w:tcPr>
-            <w:tcW w:type="dxa" w:w="5083"/>
+            <w:tcW w:type="dxa" w:w="4968"/>
             <w:shd w:fill="EAFBF9"/>
             <w:tcBorders>
               <w:top w:val="single" w:sz="8" w:color="BDEDE8"/>
@@ -6974,7 +6974,7 @@
         </w:tc>
         <w:tc>
           <w:tcPr>
-            <w:tcW w:type="dxa" w:w="5083"/>
+            <w:tcW w:type="dxa" w:w="4968"/>
             <w:shd w:fill="EAFBF9"/>
             <w:tcBorders>
               <w:top w:val="single" w:sz="8" w:color="BDEDE8"/>
@@ -7054,7 +7054,7 @@
       <w:tr>
         <w:tc>
           <w:tcPr>
-            <w:tcW w:type="dxa" w:w="3389"/>
+            <w:tcW w:type="dxa" w:w="3312"/>
             <w:shd w:fill="1A1A5E"/>
             <w:tcBorders>
               <w:top w:val="single" w:sz="8" w:color="1A1A5E"/>
@@ -7082,7 +7082,7 @@
         </w:tc>
         <w:tc>
           <w:tcPr>
-            <w:tcW w:type="dxa" w:w="3389"/>
+            <w:tcW w:type="dxa" w:w="3312"/>
             <w:shd w:fill="1A1A5E"/>
             <w:tcBorders>
               <w:top w:val="single" w:sz="8" w:color="1A1A5E"/>
@@ -7110,7 +7110,7 @@
         </w:tc>
         <w:tc>
           <w:tcPr>
-            <w:tcW w:type="dxa" w:w="3389"/>
+            <w:tcW w:type="dxa" w:w="3312"/>
             <w:shd w:fill="1A1A5E"/>
             <w:tcBorders>
               <w:top w:val="single" w:sz="8" w:color="1A1A5E"/>
@@ -7492,7 +7492,7 @@
       <w:tr>
         <w:tc>
           <w:tcPr>
-            <w:tcW w:type="dxa" w:w="5083"/>
+            <w:tcW w:type="dxa" w:w="4968"/>
             <w:shd w:fill="1A1A5E"/>
             <w:tcBorders>
               <w:top w:val="single" w:sz="8" w:color="1A1A5E"/>
@@ -7520,7 +7520,7 @@
         </w:tc>
         <w:tc>
           <w:tcPr>
-            <w:tcW w:type="dxa" w:w="5083"/>
+            <w:tcW w:type="dxa" w:w="4968"/>
             <w:shd w:fill="1A1A5E"/>
             <w:tcBorders>
               <w:top w:val="single" w:sz="8" w:color="1A1A5E"/>
@@ -7873,7 +7873,7 @@
       <w:tr>
         <w:tc>
           <w:tcPr>
-            <w:tcW w:type="dxa" w:w="2541"/>
+            <w:tcW w:type="dxa" w:w="2484"/>
             <w:shd w:fill="1A1A5E"/>
             <w:tcBorders>
               <w:top w:val="single" w:sz="8" w:color="1A1A5E"/>
@@ -7901,7 +7901,7 @@
         </w:tc>
         <w:tc>
           <w:tcPr>
-            <w:tcW w:type="dxa" w:w="2541"/>
+            <w:tcW w:type="dxa" w:w="2484"/>
             <w:shd w:fill="1A1A5E"/>
             <w:tcBorders>
               <w:top w:val="single" w:sz="8" w:color="1A1A5E"/>
@@ -7929,7 +7929,7 @@
         </w:tc>
         <w:tc>
           <w:tcPr>
-            <w:tcW w:type="dxa" w:w="2541"/>
+            <w:tcW w:type="dxa" w:w="2484"/>
             <w:shd w:fill="1A1A5E"/>
             <w:tcBorders>
               <w:top w:val="single" w:sz="8" w:color="1A1A5E"/>
@@ -7957,7 +7957,7 @@
         </w:tc>
         <w:tc>
           <w:tcPr>
-            <w:tcW w:type="dxa" w:w="2541"/>
+            <w:tcW w:type="dxa" w:w="2484"/>
             <w:shd w:fill="1A1A5E"/>
             <w:tcBorders>
               <w:top w:val="single" w:sz="8" w:color="1A1A5E"/>
@@ -8391,7 +8391,7 @@
       <w:tr>
         <w:tc>
           <w:tcPr>
-            <w:tcW w:type="dxa" w:w="5083"/>
+            <w:tcW w:type="dxa" w:w="4968"/>
             <w:shd w:fill="1A1A5E"/>
             <w:tcBorders>
               <w:top w:val="single" w:sz="8" w:color="1A1A5E"/>
@@ -8419,7 +8419,7 @@
         </w:tc>
         <w:tc>
           <w:tcPr>
-            <w:tcW w:type="dxa" w:w="5083"/>
+            <w:tcW w:type="dxa" w:w="4968"/>
             <w:shd w:fill="1A1A5E"/>
             <w:tcBorders>
               <w:top w:val="single" w:sz="8" w:color="1A1A5E"/>
@@ -8814,7 +8814,7 @@
       <w:tr>
         <w:tc>
           <w:tcPr>
-            <w:tcW w:type="dxa" w:w="5083"/>
+            <w:tcW w:type="dxa" w:w="4968"/>
             <w:shd w:fill="EAFBF9"/>
             <w:tcBorders>
               <w:top w:val="single" w:sz="8" w:color="BDEDE8"/>
@@ -8842,7 +8842,7 @@
         </w:tc>
         <w:tc>
           <w:tcPr>
-            <w:tcW w:type="dxa" w:w="5083"/>
+            <w:tcW w:type="dxa" w:w="4968"/>
             <w:shd w:fill="EAFBF9"/>
             <w:tcBorders>
               <w:top w:val="single" w:sz="8" w:color="BDEDE8"/>
@@ -9011,7 +9011,7 @@
       <w:tr>
         <w:tc>
           <w:tcPr>
-            <w:tcW w:type="dxa" w:w="5083"/>
+            <w:tcW w:type="dxa" w:w="4968"/>
             <w:shd w:fill="EAFBF9"/>
             <w:tcBorders>
               <w:top w:val="single" w:sz="8" w:color="BDEDE8"/>
@@ -9039,7 +9039,7 @@
         </w:tc>
         <w:tc>
           <w:tcPr>
-            <w:tcW w:type="dxa" w:w="5083"/>
+            <w:tcW w:type="dxa" w:w="4968"/>
             <w:shd w:fill="EAFBF9"/>
             <w:tcBorders>
               <w:top w:val="single" w:sz="8" w:color="BDEDE8"/>
@@ -9165,7 +9165,7 @@
       <w:headerReference w:type="default" r:id="rId9"/>
       <w:footerReference w:type="default" r:id="rId10"/>
       <w:pgSz w:w="12240" w:h="15840"/>
-      <w:pgMar w:top="893" w:right="1037" w:bottom="893" w:left="1037" w:header="720" w:footer="720" w:gutter="0"/>
+      <w:pgMar w:top="893" w:right="1152" w:bottom="893" w:left="1152" w:header="720" w:footer="720" w:gutter="0"/>
       <w:cols w:space="720"/>
       <w:docGrid w:linePitch="360"/>
     </w:sectPr>

</xml_diff>